<commit_message>
Perfiles de la consola actualizados y reglas listas para publicar
- roles/alumno, roles/prefecto y roles/enfermeria en Firestore ya coinciden
  con firebase/roles.json (No. de control y Enfermería en web).
- Las reglas nuevas quedaron pegadas en la consola; falta presionar Publicar.
- Bitácora 20-04 y PENDIENTES actualizados (y sus Word).

Co-Authored-By: Claude Opus 5.5 <noreply@anthropic.com>
</commit_message>
<xml_diff>
--- a/docs/PENDIENTES.docx
+++ b/docs/PENDIENTES.docx
@@ -44,7 +44,7 @@
           <w:sz w:val="22"/>
           <w:szCs w:val="22"/>
         </w:rPr>
-        <w:t xml:space="preserve"> 19 de octubre de 2026</w:t>
+        <w:t xml:space="preserve"> 20 de octubre de 2026 (actualizado con ADR-010 y la web)</w:t>
       </w:r>
     </w:p>
     <w:p>
@@ -321,7 +321,7 @@
           <w:sz w:val="22"/>
           <w:szCs w:val="22"/>
         </w:rPr>
-        <w:pict w14:anchorId="5ED07BDF">
+        <w:pict w14:anchorId="7F9E3DF6">
           <v:rect id="_x0000_i1025" style="width:0;height:1.5pt" o:hralign="center" o:hrstd="t" o:hr="t" fillcolor="#a0a0a0" stroked="f"/>
         </w:pict>
       </w:r>
@@ -353,9 +353,9 @@
       </w:tblPr>
       <w:tblGrid>
         <w:gridCol w:w="297"/>
-        <w:gridCol w:w="3894"/>
-        <w:gridCol w:w="1338"/>
-        <w:gridCol w:w="4135"/>
+        <w:gridCol w:w="4531"/>
+        <w:gridCol w:w="1079"/>
+        <w:gridCol w:w="3757"/>
       </w:tblGrid>
       <w:tr>
         <w:tc>
@@ -1051,8 +1051,562 @@
                 <w:sz w:val="19"/>
                 <w:szCs w:val="19"/>
               </w:rPr>
-              <w:t>Con 2,500 alumnos el plan Spark se queda corto en lecturas diarias; hay que decidir antes de cargar a todo el plantel. Sin Blaze tampoco hay validación del escaneo en el servidor ni avisos push</w:t>
-            </w:r>
+              <w:t>Con 2,500 alumnos el plan Spark se queda corto en lecturas diarias; hay que decidir antes de cargar a todo el plantel. Sin Blaze tampoco hay validación del escaneo en el servidor ni avisos push. Con los avisos al padre (ADR-010) se llega a unas 17,500 escrituras al día, cerca del límite gratis (20,000)</w:t>
+            </w:r>
+          </w:p>
+        </w:tc>
+      </w:tr>
+      <w:tr>
+        <w:tc>
+          <w:tcPr>
+            <w:tcW w:w="0" w:type="auto"/>
+            <w:tcBorders>
+              <w:top w:val="single" w:sz="6" w:space="0" w:color="D9C9C5"/>
+              <w:left w:val="single" w:sz="6" w:space="0" w:color="D9C9C5"/>
+              <w:bottom w:val="single" w:sz="6" w:space="0" w:color="D9C9C5"/>
+              <w:right w:val="single" w:sz="6" w:space="0" w:color="D9C9C5"/>
+            </w:tcBorders>
+            <w:tcMar>
+              <w:top w:w="60" w:type="dxa"/>
+              <w:left w:w="100" w:type="dxa"/>
+              <w:bottom w:w="60" w:type="dxa"/>
+              <w:right w:w="100" w:type="dxa"/>
+            </w:tcMar>
+            <w:hideMark/>
+          </w:tcPr>
+          <w:p>
+            <w:pPr>
+              <w:pStyle w:val="celda"/>
+              <w:rPr>
+                <w:rFonts w:ascii="Calibri" w:hAnsi="Calibri" w:cs="Calibri"/>
+                <w:color w:val="1F1A1A"/>
+                <w:sz w:val="19"/>
+                <w:szCs w:val="19"/>
+              </w:rPr>
+            </w:pPr>
+            <w:r>
+              <w:rPr>
+                <w:rFonts w:ascii="Calibri" w:hAnsi="Calibri" w:cs="Calibri"/>
+                <w:color w:val="1F1A1A"/>
+                <w:sz w:val="19"/>
+                <w:szCs w:val="19"/>
+              </w:rPr>
+              <w:t>4</w:t>
+            </w:r>
+          </w:p>
+        </w:tc>
+        <w:tc>
+          <w:tcPr>
+            <w:tcW w:w="0" w:type="auto"/>
+            <w:tcBorders>
+              <w:top w:val="single" w:sz="6" w:space="0" w:color="D9C9C5"/>
+              <w:left w:val="single" w:sz="6" w:space="0" w:color="D9C9C5"/>
+              <w:bottom w:val="single" w:sz="6" w:space="0" w:color="D9C9C5"/>
+              <w:right w:val="single" w:sz="6" w:space="0" w:color="D9C9C5"/>
+            </w:tcBorders>
+            <w:tcMar>
+              <w:top w:w="60" w:type="dxa"/>
+              <w:left w:w="100" w:type="dxa"/>
+              <w:bottom w:w="60" w:type="dxa"/>
+              <w:right w:w="100" w:type="dxa"/>
+            </w:tcMar>
+            <w:hideMark/>
+          </w:tcPr>
+          <w:p>
+            <w:pPr>
+              <w:pStyle w:val="celda"/>
+              <w:rPr>
+                <w:rFonts w:ascii="Calibri" w:hAnsi="Calibri" w:cs="Calibri"/>
+                <w:color w:val="1F1A1A"/>
+                <w:sz w:val="19"/>
+                <w:szCs w:val="19"/>
+              </w:rPr>
+            </w:pPr>
+            <w:r>
+              <w:rPr>
+                <w:rFonts w:ascii="Calibri" w:hAnsi="Calibri" w:cs="Calibri"/>
+                <w:b/>
+                <w:bCs/>
+                <w:color w:val="1F1A1A"/>
+                <w:sz w:val="19"/>
+                <w:szCs w:val="19"/>
+              </w:rPr>
+              <w:t>Presionar "Publicar" en la consola</w:t>
+            </w:r>
+            <w:r>
+              <w:rPr>
+                <w:rFonts w:ascii="Calibri" w:hAnsi="Calibri" w:cs="Calibri"/>
+                <w:color w:val="1F1A1A"/>
+                <w:sz w:val="19"/>
+                <w:szCs w:val="19"/>
+              </w:rPr>
+              <w:t xml:space="preserve"> </w:t>
+            </w:r>
+            <w:r>
+              <w:rPr>
+                <w:rFonts w:ascii="Calibri" w:hAnsi="Calibri" w:cs="Calibri"/>
+                <w:color w:val="1F1A1A"/>
+                <w:sz w:val="19"/>
+                <w:szCs w:val="19"/>
+              </w:rPr>
+              <w:t xml:space="preserve">(las reglas nuevas ya están pegadas en el editor desde el 20 oct; Claude no puede publicarlas), </w:t>
+            </w:r>
+            <w:r>
+              <w:rPr>
+                <w:rFonts w:ascii="Calibri" w:hAnsi="Calibri" w:cs="Calibri"/>
+                <w:b/>
+                <w:bCs/>
+                <w:color w:val="1F1A1A"/>
+                <w:sz w:val="19"/>
+                <w:szCs w:val="19"/>
+              </w:rPr>
+              <w:t>crear el índice nuevo y, al mismo tiempo, instalar la app nueva</w:t>
+            </w:r>
+            <w:r>
+              <w:rPr>
+                <w:rFonts w:ascii="Calibri" w:hAnsi="Calibri" w:cs="Calibri"/>
+                <w:color w:val="1F1A1A"/>
+                <w:sz w:val="19"/>
+                <w:szCs w:val="19"/>
+              </w:rPr>
+              <w:t xml:space="preserve"> en los teléfonos de prueba. Los perfiles </w:t>
+            </w:r>
+            <w:r>
+              <w:rPr>
+                <w:rStyle w:val="HTMLCode"/>
+              </w:rPr>
+              <w:t>roles/alumno</w:t>
+            </w:r>
+            <w:r>
+              <w:rPr>
+                <w:rFonts w:ascii="Calibri" w:hAnsi="Calibri" w:cs="Calibri"/>
+                <w:color w:val="1F1A1A"/>
+                <w:sz w:val="19"/>
+                <w:szCs w:val="19"/>
+              </w:rPr>
+              <w:t xml:space="preserve">, </w:t>
+            </w:r>
+            <w:r>
+              <w:rPr>
+                <w:rStyle w:val="HTMLCode"/>
+              </w:rPr>
+              <w:t>roles/prefecto</w:t>
+            </w:r>
+            <w:r>
+              <w:rPr>
+                <w:rFonts w:ascii="Calibri" w:hAnsi="Calibri" w:cs="Calibri"/>
+                <w:color w:val="1F1A1A"/>
+                <w:sz w:val="19"/>
+                <w:szCs w:val="19"/>
+              </w:rPr>
+              <w:t xml:space="preserve"> y </w:t>
+            </w:r>
+            <w:r>
+              <w:rPr>
+                <w:rStyle w:val="HTMLCode"/>
+              </w:rPr>
+              <w:t>roles/enfermeria</w:t>
+            </w:r>
+            <w:r>
+              <w:rPr>
+                <w:rFonts w:ascii="Calibri" w:hAnsi="Calibri" w:cs="Calibri"/>
+                <w:color w:val="1F1A1A"/>
+                <w:sz w:val="19"/>
+                <w:szCs w:val="19"/>
+              </w:rPr>
+              <w:t xml:space="preserve"> </w:t>
+            </w:r>
+            <w:r>
+              <w:rPr>
+                <w:rFonts w:ascii="Calibri" w:hAnsi="Calibri" w:cs="Calibri"/>
+                <w:b/>
+                <w:bCs/>
+                <w:color w:val="1F1A1A"/>
+                <w:sz w:val="19"/>
+                <w:szCs w:val="19"/>
+              </w:rPr>
+              <w:t>ya se actualizaron</w:t>
+            </w:r>
+            <w:r>
+              <w:rPr>
+                <w:rFonts w:ascii="Calibri" w:hAnsi="Calibri" w:cs="Calibri"/>
+                <w:color w:val="1F1A1A"/>
+                <w:sz w:val="19"/>
+                <w:szCs w:val="19"/>
+              </w:rPr>
+              <w:t xml:space="preserve"> (bitácora 20-04)</w:t>
+            </w:r>
+          </w:p>
+        </w:tc>
+        <w:tc>
+          <w:tcPr>
+            <w:tcW w:w="0" w:type="auto"/>
+            <w:tcBorders>
+              <w:top w:val="single" w:sz="6" w:space="0" w:color="D9C9C5"/>
+              <w:left w:val="single" w:sz="6" w:space="0" w:color="D9C9C5"/>
+              <w:bottom w:val="single" w:sz="6" w:space="0" w:color="D9C9C5"/>
+              <w:right w:val="single" w:sz="6" w:space="0" w:color="D9C9C5"/>
+            </w:tcBorders>
+            <w:tcMar>
+              <w:top w:w="60" w:type="dxa"/>
+              <w:left w:w="100" w:type="dxa"/>
+              <w:bottom w:w="60" w:type="dxa"/>
+              <w:right w:w="100" w:type="dxa"/>
+            </w:tcMar>
+            <w:hideMark/>
+          </w:tcPr>
+          <w:p>
+            <w:pPr>
+              <w:pStyle w:val="celda"/>
+              <w:rPr>
+                <w:rFonts w:ascii="Calibri" w:hAnsi="Calibri" w:cs="Calibri"/>
+                <w:color w:val="1F1A1A"/>
+                <w:sz w:val="19"/>
+                <w:szCs w:val="19"/>
+              </w:rPr>
+            </w:pPr>
+            <w:r>
+              <w:rPr>
+                <w:rFonts w:ascii="Calibri" w:hAnsi="Calibri" w:cs="Calibri"/>
+                <w:color w:val="1F1A1A"/>
+                <w:sz w:val="19"/>
+                <w:szCs w:val="19"/>
+              </w:rPr>
+              <w:t>Usuario</w:t>
+            </w:r>
+          </w:p>
+        </w:tc>
+        <w:tc>
+          <w:tcPr>
+            <w:tcW w:w="0" w:type="auto"/>
+            <w:tcBorders>
+              <w:top w:val="single" w:sz="6" w:space="0" w:color="D9C9C5"/>
+              <w:left w:val="single" w:sz="6" w:space="0" w:color="D9C9C5"/>
+              <w:bottom w:val="single" w:sz="6" w:space="0" w:color="D9C9C5"/>
+              <w:right w:val="single" w:sz="6" w:space="0" w:color="D9C9C5"/>
+            </w:tcBorders>
+            <w:tcMar>
+              <w:top w:w="60" w:type="dxa"/>
+              <w:left w:w="100" w:type="dxa"/>
+              <w:bottom w:w="60" w:type="dxa"/>
+              <w:right w:w="100" w:type="dxa"/>
+            </w:tcMar>
+            <w:hideMark/>
+          </w:tcPr>
+          <w:p>
+            <w:pPr>
+              <w:pStyle w:val="celda"/>
+              <w:rPr>
+                <w:rFonts w:ascii="Calibri" w:hAnsi="Calibri" w:cs="Calibri"/>
+                <w:color w:val="1F1A1A"/>
+                <w:sz w:val="19"/>
+                <w:szCs w:val="19"/>
+              </w:rPr>
+            </w:pPr>
+            <w:r>
+              <w:rPr>
+                <w:rFonts w:ascii="Calibri" w:hAnsi="Calibri" w:cs="Calibri"/>
+                <w:color w:val="1F1A1A"/>
+                <w:sz w:val="19"/>
+                <w:szCs w:val="19"/>
+              </w:rPr>
+              <w:t xml:space="preserve">Las reglas nuevas (ADR-009 y ADR-010) piden </w:t>
+            </w:r>
+            <w:r>
+              <w:rPr>
+                <w:rStyle w:val="HTMLCode"/>
+              </w:rPr>
+              <w:t>noControl</w:t>
+            </w:r>
+            <w:r>
+              <w:rPr>
+                <w:rFonts w:ascii="Calibri" w:hAnsi="Calibri" w:cs="Calibri"/>
+                <w:color w:val="1F1A1A"/>
+                <w:sz w:val="19"/>
+                <w:szCs w:val="19"/>
+              </w:rPr>
+              <w:t xml:space="preserve"> y avisos firmados (</w:t>
+            </w:r>
+            <w:r>
+              <w:rPr>
+                <w:rStyle w:val="HTMLCode"/>
+              </w:rPr>
+              <w:t>creadaPor</w:t>
+            </w:r>
+            <w:r>
+              <w:rPr>
+                <w:rFonts w:ascii="Calibri" w:hAnsi="Calibri" w:cs="Calibri"/>
+                <w:color w:val="1F1A1A"/>
+                <w:sz w:val="19"/>
+                <w:szCs w:val="19"/>
+              </w:rPr>
+              <w:t xml:space="preserve">): con la app anterior el escaneo ya no se guardaría. El índice es </w:t>
+            </w:r>
+            <w:r>
+              <w:rPr>
+                <w:rStyle w:val="HTMLCode"/>
+              </w:rPr>
+              <w:t>registros</w:t>
+            </w:r>
+            <w:r>
+              <w:rPr>
+                <w:rFonts w:ascii="Calibri" w:hAnsi="Calibri" w:cs="Calibri"/>
+                <w:color w:val="1F1A1A"/>
+                <w:sz w:val="19"/>
+                <w:szCs w:val="19"/>
+              </w:rPr>
+              <w:t xml:space="preserve"> (</w:t>
+            </w:r>
+            <w:r>
+              <w:rPr>
+                <w:rStyle w:val="HTMLCode"/>
+              </w:rPr>
+              <w:t>fecha</w:t>
+            </w:r>
+            <w:r>
+              <w:rPr>
+                <w:rFonts w:ascii="Calibri" w:hAnsi="Calibri" w:cs="Calibri"/>
+                <w:color w:val="1F1A1A"/>
+                <w:sz w:val="19"/>
+                <w:szCs w:val="19"/>
+              </w:rPr>
+              <w:t xml:space="preserve"> ↑, </w:t>
+            </w:r>
+            <w:r>
+              <w:rPr>
+                <w:rStyle w:val="HTMLCode"/>
+              </w:rPr>
+              <w:t>alerta</w:t>
+            </w:r>
+            <w:r>
+              <w:rPr>
+                <w:rFonts w:ascii="Calibri" w:hAnsi="Calibri" w:cs="Calibri"/>
+                <w:color w:val="1F1A1A"/>
+                <w:sz w:val="19"/>
+                <w:szCs w:val="19"/>
+              </w:rPr>
+              <w:t xml:space="preserve"> ↑, </w:t>
+            </w:r>
+            <w:r>
+              <w:rPr>
+                <w:rStyle w:val="HTMLCode"/>
+              </w:rPr>
+              <w:t>fechaHora</w:t>
+            </w:r>
+            <w:r>
+              <w:rPr>
+                <w:rFonts w:ascii="Calibri" w:hAnsi="Calibri" w:cs="Calibri"/>
+                <w:color w:val="1F1A1A"/>
+                <w:sz w:val="19"/>
+                <w:szCs w:val="19"/>
+              </w:rPr>
+              <w:t xml:space="preserve"> </w:t>
+            </w:r>
+            <w:r>
+              <w:rPr>
+                <w:rFonts w:ascii="Calibri" w:hAnsi="Calibri" w:cs="Calibri"/>
+                <w:color w:val="1F1A1A"/>
+                <w:sz w:val="19"/>
+                <w:szCs w:val="19"/>
+              </w:rPr>
+              <w:t>↓); sin él, "Alertas de hoy" se ve vacía</w:t>
+            </w:r>
+          </w:p>
+        </w:tc>
+      </w:tr>
+      <w:tr>
+        <w:tc>
+          <w:tcPr>
+            <w:tcW w:w="0" w:type="auto"/>
+            <w:tcBorders>
+              <w:top w:val="single" w:sz="6" w:space="0" w:color="D9C9C5"/>
+              <w:left w:val="single" w:sz="6" w:space="0" w:color="D9C9C5"/>
+              <w:bottom w:val="single" w:sz="6" w:space="0" w:color="D9C9C5"/>
+              <w:right w:val="single" w:sz="6" w:space="0" w:color="D9C9C5"/>
+            </w:tcBorders>
+            <w:tcMar>
+              <w:top w:w="60" w:type="dxa"/>
+              <w:left w:w="100" w:type="dxa"/>
+              <w:bottom w:w="60" w:type="dxa"/>
+              <w:right w:w="100" w:type="dxa"/>
+            </w:tcMar>
+            <w:hideMark/>
+          </w:tcPr>
+          <w:p>
+            <w:pPr>
+              <w:pStyle w:val="celda"/>
+              <w:rPr>
+                <w:rFonts w:ascii="Calibri" w:hAnsi="Calibri" w:cs="Calibri"/>
+                <w:color w:val="1F1A1A"/>
+                <w:sz w:val="19"/>
+                <w:szCs w:val="19"/>
+              </w:rPr>
+            </w:pPr>
+            <w:r>
+              <w:rPr>
+                <w:rFonts w:ascii="Calibri" w:hAnsi="Calibri" w:cs="Calibri"/>
+                <w:color w:val="1F1A1A"/>
+                <w:sz w:val="19"/>
+                <w:szCs w:val="19"/>
+              </w:rPr>
+              <w:lastRenderedPageBreak/>
+              <w:t>5</w:t>
+            </w:r>
+          </w:p>
+        </w:tc>
+        <w:tc>
+          <w:tcPr>
+            <w:tcW w:w="0" w:type="auto"/>
+            <w:tcBorders>
+              <w:top w:val="single" w:sz="6" w:space="0" w:color="D9C9C5"/>
+              <w:left w:val="single" w:sz="6" w:space="0" w:color="D9C9C5"/>
+              <w:bottom w:val="single" w:sz="6" w:space="0" w:color="D9C9C5"/>
+              <w:right w:val="single" w:sz="6" w:space="0" w:color="D9C9C5"/>
+            </w:tcBorders>
+            <w:tcMar>
+              <w:top w:w="60" w:type="dxa"/>
+              <w:left w:w="100" w:type="dxa"/>
+              <w:bottom w:w="60" w:type="dxa"/>
+              <w:right w:w="100" w:type="dxa"/>
+            </w:tcMar>
+            <w:hideMark/>
+          </w:tcPr>
+          <w:p>
+            <w:pPr>
+              <w:pStyle w:val="celda"/>
+              <w:rPr>
+                <w:rFonts w:ascii="Calibri" w:hAnsi="Calibri" w:cs="Calibri"/>
+                <w:color w:val="1F1A1A"/>
+                <w:sz w:val="19"/>
+                <w:szCs w:val="19"/>
+              </w:rPr>
+            </w:pPr>
+            <w:r>
+              <w:rPr>
+                <w:rFonts w:ascii="Calibri" w:hAnsi="Calibri" w:cs="Calibri"/>
+                <w:b/>
+                <w:bCs/>
+                <w:color w:val="1F1A1A"/>
+                <w:sz w:val="19"/>
+                <w:szCs w:val="19"/>
+              </w:rPr>
+              <w:t xml:space="preserve">Registrar la web en Firebase, llenar </w:t>
+            </w:r>
+            <w:r>
+              <w:rPr>
+                <w:rStyle w:val="HTMLCode"/>
+                <w:b/>
+                <w:bCs/>
+              </w:rPr>
+              <w:t>web/js/config.js</w:t>
+            </w:r>
+            <w:r>
+              <w:rPr>
+                <w:rFonts w:ascii="Calibri" w:hAnsi="Calibri" w:cs="Calibri"/>
+                <w:b/>
+                <w:bCs/>
+                <w:color w:val="1F1A1A"/>
+                <w:sz w:val="19"/>
+                <w:szCs w:val="19"/>
+              </w:rPr>
+              <w:t xml:space="preserve"> y publicarla</w:t>
+            </w:r>
+            <w:r>
+              <w:rPr>
+                <w:rFonts w:ascii="Calibri" w:hAnsi="Calibri" w:cs="Calibri"/>
+                <w:color w:val="1F1A1A"/>
+                <w:sz w:val="19"/>
+                <w:szCs w:val="19"/>
+              </w:rPr>
+              <w:t xml:space="preserve"> con Firebase Hosting</w:t>
+            </w:r>
+          </w:p>
+        </w:tc>
+        <w:tc>
+          <w:tcPr>
+            <w:tcW w:w="0" w:type="auto"/>
+            <w:tcBorders>
+              <w:top w:val="single" w:sz="6" w:space="0" w:color="D9C9C5"/>
+              <w:left w:val="single" w:sz="6" w:space="0" w:color="D9C9C5"/>
+              <w:bottom w:val="single" w:sz="6" w:space="0" w:color="D9C9C5"/>
+              <w:right w:val="single" w:sz="6" w:space="0" w:color="D9C9C5"/>
+            </w:tcBorders>
+            <w:tcMar>
+              <w:top w:w="60" w:type="dxa"/>
+              <w:left w:w="100" w:type="dxa"/>
+              <w:bottom w:w="60" w:type="dxa"/>
+              <w:right w:w="100" w:type="dxa"/>
+            </w:tcMar>
+            <w:hideMark/>
+          </w:tcPr>
+          <w:p>
+            <w:pPr>
+              <w:pStyle w:val="celda"/>
+              <w:rPr>
+                <w:rFonts w:ascii="Calibri" w:hAnsi="Calibri" w:cs="Calibri"/>
+                <w:color w:val="1F1A1A"/>
+                <w:sz w:val="19"/>
+                <w:szCs w:val="19"/>
+              </w:rPr>
+            </w:pPr>
+            <w:r>
+              <w:rPr>
+                <w:rFonts w:ascii="Calibri" w:hAnsi="Calibri" w:cs="Calibri"/>
+                <w:color w:val="1F1A1A"/>
+                <w:sz w:val="19"/>
+                <w:szCs w:val="19"/>
+              </w:rPr>
+              <w:t>Usuario</w:t>
+            </w:r>
+          </w:p>
+        </w:tc>
+        <w:tc>
+          <w:tcPr>
+            <w:tcW w:w="0" w:type="auto"/>
+            <w:tcBorders>
+              <w:top w:val="single" w:sz="6" w:space="0" w:color="D9C9C5"/>
+              <w:left w:val="single" w:sz="6" w:space="0" w:color="D9C9C5"/>
+              <w:bottom w:val="single" w:sz="6" w:space="0" w:color="D9C9C5"/>
+              <w:right w:val="single" w:sz="6" w:space="0" w:color="D9C9C5"/>
+            </w:tcBorders>
+            <w:tcMar>
+              <w:top w:w="60" w:type="dxa"/>
+              <w:left w:w="100" w:type="dxa"/>
+              <w:bottom w:w="60" w:type="dxa"/>
+              <w:right w:w="100" w:type="dxa"/>
+            </w:tcMar>
+            <w:hideMark/>
+          </w:tcPr>
+          <w:p>
+            <w:pPr>
+              <w:pStyle w:val="celda"/>
+              <w:rPr>
+                <w:rFonts w:ascii="Calibri" w:hAnsi="Calibri" w:cs="Calibri"/>
+                <w:color w:val="1F1A1A"/>
+                <w:sz w:val="19"/>
+                <w:szCs w:val="19"/>
+              </w:rPr>
+            </w:pPr>
+            <w:r>
+              <w:rPr>
+                <w:rFonts w:ascii="Calibri" w:hAnsi="Calibri" w:cs="Calibri"/>
+                <w:color w:val="1F1A1A"/>
+                <w:sz w:val="19"/>
+                <w:szCs w:val="19"/>
+              </w:rPr>
+              <w:t xml:space="preserve">Sin esto Control Escolar y Enfermería siguen usando la consola. Pasos en </w:t>
+            </w:r>
+            <w:hyperlink r:id="rId5" w:history="1">
+              <w:r>
+                <w:rPr>
+                  <w:rStyle w:val="Hyperlink"/>
+                  <w:rFonts w:ascii="Calibri" w:hAnsi="Calibri" w:cs="Calibri"/>
+                  <w:sz w:val="19"/>
+                  <w:szCs w:val="19"/>
+                </w:rPr>
+                <w:t>web/README.md</w:t>
+              </w:r>
+            </w:hyperlink>
           </w:p>
         </w:tc>
       </w:tr>
@@ -1093,7 +1647,7 @@
           <w:sz w:val="22"/>
           <w:szCs w:val="22"/>
         </w:rPr>
-        <w:pict w14:anchorId="7F2D1351">
+        <w:pict w14:anchorId="74BBF45C">
           <v:rect id="_x0000_i1026" style="width:0;height:1.5pt" o:hralign="center" o:hrstd="t" o:hr="t" fillcolor="#a0a0a0" stroked="f"/>
         </w:pict>
       </w:r>
@@ -1199,7 +1753,7 @@
           <w:sz w:val="22"/>
           <w:szCs w:val="22"/>
         </w:rPr>
-        <w:t>Escaneo del prefecto: escáner QR, captura por No. de control, resultado y alertas.</w:t>
+        <w:t>~~Escaneo del prefecto: escáner QR, captura por No. de control, resultado y alertas.~~ Hecho (ADR-009); avisos y alertas del día, hechos (ADR-010).</w:t>
       </w:r>
     </w:p>
     <w:p>
@@ -1247,7 +1801,6 @@
           <w:sz w:val="22"/>
           <w:szCs w:val="22"/>
         </w:rPr>
-        <w:lastRenderedPageBreak/>
         <w:t>Importación masiva de alumnos y cambio de semestre.</w:t>
       </w:r>
     </w:p>
@@ -1272,7 +1825,42 @@
           <w:sz w:val="22"/>
           <w:szCs w:val="22"/>
         </w:rPr>
-        <w:t>Web de Control Escolar y Enfermería.</w:t>
+        <w:t xml:space="preserve">Web de Control Escolar y Enfermería. </w:t>
+      </w:r>
+      <w:r>
+        <w:rPr>
+          <w:rFonts w:ascii="Calibri" w:eastAsia="Times New Roman" w:hAnsi="Calibri" w:cs="Calibri"/>
+          <w:b/>
+          <w:bCs/>
+          <w:color w:val="1F1A1A"/>
+          <w:sz w:val="22"/>
+          <w:szCs w:val="22"/>
+        </w:rPr>
+        <w:t>Empezada el 20 de octubre</w:t>
+      </w:r>
+      <w:r>
+        <w:rPr>
+          <w:rFonts w:ascii="Calibri" w:eastAsia="Times New Roman" w:hAnsi="Calibri" w:cs="Calibri"/>
+          <w:color w:val="1F1A1A"/>
+          <w:sz w:val="22"/>
+          <w:szCs w:val="22"/>
+        </w:rPr>
+        <w:t xml:space="preserve"> (ADR-011, carpeta </w:t>
+      </w:r>
+      <w:r>
+        <w:rPr>
+          <w:rStyle w:val="HTMLCode"/>
+        </w:rPr>
+        <w:t>web/</w:t>
+      </w:r>
+      <w:r>
+        <w:rPr>
+          <w:rFonts w:ascii="Calibri" w:eastAsia="Times New Roman" w:hAnsi="Calibri" w:cs="Calibri"/>
+          <w:color w:val="1F1A1A"/>
+          <w:sz w:val="22"/>
+          <w:szCs w:val="22"/>
+        </w:rPr>
+        <w:t>): falta publicarla y lo que dice la sección 8.</w:t>
       </w:r>
     </w:p>
     <w:p>
@@ -1422,7 +2010,7 @@
           <w:sz w:val="22"/>
           <w:szCs w:val="22"/>
         </w:rPr>
-        <w:pict w14:anchorId="7F4B0D8C">
+        <w:pict w14:anchorId="699A6023">
           <v:rect id="_x0000_i1027" style="width:0;height:1.5pt" o:hralign="center" o:hrstd="t" o:hr="t" fillcolor="#a0a0a0" stroked="f"/>
         </w:pict>
       </w:r>
@@ -1453,10 +2041,10 @@
         <w:tblLook w:val="04A0" w:firstRow="1" w:lastRow="0" w:firstColumn="1" w:lastColumn="0" w:noHBand="0" w:noVBand="1"/>
       </w:tblPr>
       <w:tblGrid>
-        <w:gridCol w:w="2439"/>
-        <w:gridCol w:w="2721"/>
-        <w:gridCol w:w="3130"/>
-        <w:gridCol w:w="1374"/>
+        <w:gridCol w:w="1781"/>
+        <w:gridCol w:w="4491"/>
+        <w:gridCol w:w="2304"/>
+        <w:gridCol w:w="1088"/>
       </w:tblGrid>
       <w:tr>
         <w:tc>
@@ -2001,6 +2589,7 @@
                 <w:sz w:val="19"/>
                 <w:szCs w:val="19"/>
               </w:rPr>
+              <w:lastRenderedPageBreak/>
               <w:t>¿Qué diferencia hay entre reporte y llamada de atención? ¿Los ven el alumno y el padre?</w:t>
             </w:r>
           </w:p>
@@ -2077,45 +2666,65 @@
                 <w:sz w:val="19"/>
                 <w:szCs w:val="19"/>
               </w:rPr>
-              <w:t>Por definir</w:t>
-            </w:r>
-          </w:p>
-        </w:tc>
-        <w:tc>
-          <w:tcPr>
-            <w:tcW w:w="0" w:type="auto"/>
-            <w:tcBorders>
-              <w:top w:val="single" w:sz="6" w:space="0" w:color="D9C9C5"/>
-              <w:left w:val="single" w:sz="6" w:space="0" w:color="D9C9C5"/>
-              <w:bottom w:val="single" w:sz="6" w:space="0" w:color="D9C9C5"/>
-              <w:right w:val="single" w:sz="6" w:space="0" w:color="D9C9C5"/>
-            </w:tcBorders>
-            <w:tcMar>
-              <w:top w:w="60" w:type="dxa"/>
-              <w:left w:w="100" w:type="dxa"/>
-              <w:bottom w:w="60" w:type="dxa"/>
-              <w:right w:w="100" w:type="dxa"/>
-            </w:tcMar>
-            <w:hideMark/>
-          </w:tcPr>
-          <w:p>
-            <w:pPr>
-              <w:pStyle w:val="celda"/>
-              <w:rPr>
-                <w:rFonts w:ascii="Calibri" w:hAnsi="Calibri" w:cs="Calibri"/>
-                <w:color w:val="1F1A1A"/>
-                <w:sz w:val="19"/>
-                <w:szCs w:val="19"/>
-              </w:rPr>
-            </w:pPr>
-            <w:r>
-              <w:rPr>
-                <w:rFonts w:ascii="Calibri" w:hAnsi="Calibri" w:cs="Calibri"/>
-                <w:color w:val="1F1A1A"/>
-                <w:sz w:val="19"/>
-                <w:szCs w:val="19"/>
-              </w:rPr>
-              <w:t>Pantallas por rol</w:t>
+              <w:t xml:space="preserve">Desde ADR-010 el </w:t>
+            </w:r>
+            <w:r>
+              <w:rPr>
+                <w:rFonts w:ascii="Calibri" w:hAnsi="Calibri" w:cs="Calibri"/>
+                <w:b/>
+                <w:bCs/>
+                <w:color w:val="1F1A1A"/>
+                <w:sz w:val="19"/>
+                <w:szCs w:val="19"/>
+              </w:rPr>
+              <w:t>padre recibe un aviso</w:t>
+            </w:r>
+            <w:r>
+              <w:rPr>
+                <w:rFonts w:ascii="Calibri" w:hAnsi="Calibri" w:cs="Calibri"/>
+                <w:color w:val="1F1A1A"/>
+                <w:sz w:val="19"/>
+                <w:szCs w:val="19"/>
+              </w:rPr>
+              <w:t xml:space="preserve"> de cada falta, reporte, llamada de atención y castigo (con la descripción); el alumno no</w:t>
+            </w:r>
+          </w:p>
+        </w:tc>
+        <w:tc>
+          <w:tcPr>
+            <w:tcW w:w="0" w:type="auto"/>
+            <w:tcBorders>
+              <w:top w:val="single" w:sz="6" w:space="0" w:color="D9C9C5"/>
+              <w:left w:val="single" w:sz="6" w:space="0" w:color="D9C9C5"/>
+              <w:bottom w:val="single" w:sz="6" w:space="0" w:color="D9C9C5"/>
+              <w:right w:val="single" w:sz="6" w:space="0" w:color="D9C9C5"/>
+            </w:tcBorders>
+            <w:tcMar>
+              <w:top w:w="60" w:type="dxa"/>
+              <w:left w:w="100" w:type="dxa"/>
+              <w:bottom w:w="60" w:type="dxa"/>
+              <w:right w:w="100" w:type="dxa"/>
+            </w:tcMar>
+            <w:hideMark/>
+          </w:tcPr>
+          <w:p>
+            <w:pPr>
+              <w:pStyle w:val="celda"/>
+              <w:rPr>
+                <w:rFonts w:ascii="Calibri" w:hAnsi="Calibri" w:cs="Calibri"/>
+                <w:color w:val="1F1A1A"/>
+                <w:sz w:val="19"/>
+                <w:szCs w:val="19"/>
+              </w:rPr>
+            </w:pPr>
+            <w:r>
+              <w:rPr>
+                <w:rFonts w:ascii="Calibri" w:hAnsi="Calibri" w:cs="Calibri"/>
+                <w:color w:val="1F1A1A"/>
+                <w:sz w:val="19"/>
+                <w:szCs w:val="19"/>
+              </w:rPr>
+              <w:t>Pantallas por rol, ADR-010</w:t>
             </w:r>
           </w:p>
         </w:tc>
@@ -2155,121 +2764,133 @@
                 <w:sz w:val="19"/>
                 <w:szCs w:val="19"/>
               </w:rPr>
-              <w:t>¿Qué pasa al escanear a un alumno con falta notificada, reporte, llamada de atención o alta para prácticas?</w:t>
-            </w:r>
-          </w:p>
-        </w:tc>
-        <w:tc>
-          <w:tcPr>
-            <w:tcW w:w="0" w:type="auto"/>
-            <w:tcBorders>
-              <w:top w:val="single" w:sz="6" w:space="0" w:color="D9C9C5"/>
-              <w:left w:val="single" w:sz="6" w:space="0" w:color="D9C9C5"/>
-              <w:bottom w:val="single" w:sz="6" w:space="0" w:color="D9C9C5"/>
-              <w:right w:val="single" w:sz="6" w:space="0" w:color="D9C9C5"/>
-            </w:tcBorders>
-            <w:tcMar>
-              <w:top w:w="60" w:type="dxa"/>
-              <w:left w:w="100" w:type="dxa"/>
-              <w:bottom w:w="60" w:type="dxa"/>
-              <w:right w:w="100" w:type="dxa"/>
-            </w:tcMar>
-            <w:hideMark/>
-          </w:tcPr>
-          <w:p>
-            <w:pPr>
-              <w:pStyle w:val="celda"/>
-              <w:rPr>
-                <w:rFonts w:ascii="Calibri" w:hAnsi="Calibri" w:cs="Calibri"/>
-                <w:color w:val="1F1A1A"/>
-                <w:sz w:val="19"/>
-                <w:szCs w:val="19"/>
-              </w:rPr>
-            </w:pPr>
-            <w:r>
-              <w:rPr>
-                <w:rFonts w:ascii="Calibri" w:hAnsi="Calibri" w:cs="Calibri"/>
-                <w:color w:val="1F1A1A"/>
-                <w:sz w:val="19"/>
-                <w:szCs w:val="19"/>
-              </w:rPr>
-              <w:t>Las alertas del escaneo</w:t>
-            </w:r>
-          </w:p>
-        </w:tc>
-        <w:tc>
-          <w:tcPr>
-            <w:tcW w:w="0" w:type="auto"/>
-            <w:tcBorders>
-              <w:top w:val="single" w:sz="6" w:space="0" w:color="D9C9C5"/>
-              <w:left w:val="single" w:sz="6" w:space="0" w:color="D9C9C5"/>
-              <w:bottom w:val="single" w:sz="6" w:space="0" w:color="D9C9C5"/>
-              <w:right w:val="single" w:sz="6" w:space="0" w:color="D9C9C5"/>
-            </w:tcBorders>
-            <w:tcMar>
-              <w:top w:w="60" w:type="dxa"/>
-              <w:left w:w="100" w:type="dxa"/>
-              <w:bottom w:w="60" w:type="dxa"/>
-              <w:right w:w="100" w:type="dxa"/>
-            </w:tcMar>
-            <w:hideMark/>
-          </w:tcPr>
-          <w:p>
-            <w:pPr>
-              <w:pStyle w:val="celda"/>
-              <w:rPr>
-                <w:rFonts w:ascii="Calibri" w:hAnsi="Calibri" w:cs="Calibri"/>
-                <w:color w:val="1F1A1A"/>
-                <w:sz w:val="19"/>
-                <w:szCs w:val="19"/>
-              </w:rPr>
-            </w:pPr>
-            <w:r>
-              <w:rPr>
-                <w:rFonts w:ascii="Calibri" w:hAnsi="Calibri" w:cs="Calibri"/>
-                <w:color w:val="1F1A1A"/>
-                <w:sz w:val="19"/>
-                <w:szCs w:val="19"/>
-              </w:rPr>
-              <w:t>Hoy no generan alerta; "en prácticas" puede salir sin alerta (ADR-009)</w:t>
-            </w:r>
-          </w:p>
-        </w:tc>
-        <w:tc>
-          <w:tcPr>
-            <w:tcW w:w="0" w:type="auto"/>
-            <w:tcBorders>
-              <w:top w:val="single" w:sz="6" w:space="0" w:color="D9C9C5"/>
-              <w:left w:val="single" w:sz="6" w:space="0" w:color="D9C9C5"/>
-              <w:bottom w:val="single" w:sz="6" w:space="0" w:color="D9C9C5"/>
-              <w:right w:val="single" w:sz="6" w:space="0" w:color="D9C9C5"/>
-            </w:tcBorders>
-            <w:tcMar>
-              <w:top w:w="60" w:type="dxa"/>
-              <w:left w:w="100" w:type="dxa"/>
-              <w:bottom w:w="60" w:type="dxa"/>
-              <w:right w:w="100" w:type="dxa"/>
-            </w:tcMar>
-            <w:hideMark/>
-          </w:tcPr>
-          <w:p>
-            <w:pPr>
-              <w:pStyle w:val="celda"/>
-              <w:rPr>
-                <w:rFonts w:ascii="Calibri" w:hAnsi="Calibri" w:cs="Calibri"/>
-                <w:color w:val="1F1A1A"/>
-                <w:sz w:val="19"/>
-                <w:szCs w:val="19"/>
-              </w:rPr>
-            </w:pPr>
-            <w:r>
-              <w:rPr>
-                <w:rFonts w:ascii="Calibri" w:hAnsi="Calibri" w:cs="Calibri"/>
-                <w:color w:val="1F1A1A"/>
-                <w:sz w:val="19"/>
-                <w:szCs w:val="19"/>
-              </w:rPr>
-              <w:t>Pantallas por rol (tabla de estatus)</w:t>
+              <w:t>¿De qué se le avisa al padre?</w:t>
+            </w:r>
+          </w:p>
+        </w:tc>
+        <w:tc>
+          <w:tcPr>
+            <w:tcW w:w="0" w:type="auto"/>
+            <w:tcBorders>
+              <w:top w:val="single" w:sz="6" w:space="0" w:color="D9C9C5"/>
+              <w:left w:val="single" w:sz="6" w:space="0" w:color="D9C9C5"/>
+              <w:bottom w:val="single" w:sz="6" w:space="0" w:color="D9C9C5"/>
+              <w:right w:val="single" w:sz="6" w:space="0" w:color="D9C9C5"/>
+            </w:tcBorders>
+            <w:tcMar>
+              <w:top w:w="60" w:type="dxa"/>
+              <w:left w:w="100" w:type="dxa"/>
+              <w:bottom w:w="60" w:type="dxa"/>
+              <w:right w:w="100" w:type="dxa"/>
+            </w:tcMar>
+            <w:hideMark/>
+          </w:tcPr>
+          <w:p>
+            <w:pPr>
+              <w:pStyle w:val="celda"/>
+              <w:rPr>
+                <w:rFonts w:ascii="Calibri" w:hAnsi="Calibri" w:cs="Calibri"/>
+                <w:color w:val="1F1A1A"/>
+                <w:sz w:val="19"/>
+                <w:szCs w:val="19"/>
+              </w:rPr>
+            </w:pPr>
+            <w:r>
+              <w:rPr>
+                <w:rStyle w:val="HTMLCode"/>
+              </w:rPr>
+              <w:t>configuracion/plantel.avisarAlPadreEstatus</w:t>
+            </w:r>
+            <w:r>
+              <w:rPr>
+                <w:rFonts w:ascii="Calibri" w:hAnsi="Calibri" w:cs="Calibri"/>
+                <w:color w:val="1F1A1A"/>
+                <w:sz w:val="19"/>
+                <w:szCs w:val="19"/>
+              </w:rPr>
+              <w:t xml:space="preserve"> y </w:t>
+            </w:r>
+            <w:r>
+              <w:rPr>
+                <w:rStyle w:val="HTMLCode"/>
+              </w:rPr>
+              <w:t>avisarAlPadreAlertas</w:t>
+            </w:r>
+          </w:p>
+        </w:tc>
+        <w:tc>
+          <w:tcPr>
+            <w:tcW w:w="0" w:type="auto"/>
+            <w:tcBorders>
+              <w:top w:val="single" w:sz="6" w:space="0" w:color="D9C9C5"/>
+              <w:left w:val="single" w:sz="6" w:space="0" w:color="D9C9C5"/>
+              <w:bottom w:val="single" w:sz="6" w:space="0" w:color="D9C9C5"/>
+              <w:right w:val="single" w:sz="6" w:space="0" w:color="D9C9C5"/>
+            </w:tcBorders>
+            <w:tcMar>
+              <w:top w:w="60" w:type="dxa"/>
+              <w:left w:w="100" w:type="dxa"/>
+              <w:bottom w:w="60" w:type="dxa"/>
+              <w:right w:w="100" w:type="dxa"/>
+            </w:tcMar>
+            <w:hideMark/>
+          </w:tcPr>
+          <w:p>
+            <w:pPr>
+              <w:pStyle w:val="celda"/>
+              <w:rPr>
+                <w:rFonts w:ascii="Calibri" w:hAnsi="Calibri" w:cs="Calibri"/>
+                <w:color w:val="1F1A1A"/>
+                <w:sz w:val="19"/>
+                <w:szCs w:val="19"/>
+              </w:rPr>
+            </w:pPr>
+            <w:r>
+              <w:rPr>
+                <w:rFonts w:ascii="Calibri" w:hAnsi="Calibri" w:cs="Calibri"/>
+                <w:color w:val="1F1A1A"/>
+                <w:sz w:val="19"/>
+                <w:szCs w:val="19"/>
+              </w:rPr>
+              <w:t>Por omisión: los cuatro estatus del profesor y las alertas "inactivo" y "salida fuera de horario" (además de cada entrada y salida). Se cambia en la consola sin programar</w:t>
+            </w:r>
+          </w:p>
+        </w:tc>
+        <w:tc>
+          <w:tcPr>
+            <w:tcW w:w="0" w:type="auto"/>
+            <w:tcBorders>
+              <w:top w:val="single" w:sz="6" w:space="0" w:color="D9C9C5"/>
+              <w:left w:val="single" w:sz="6" w:space="0" w:color="D9C9C5"/>
+              <w:bottom w:val="single" w:sz="6" w:space="0" w:color="D9C9C5"/>
+              <w:right w:val="single" w:sz="6" w:space="0" w:color="D9C9C5"/>
+            </w:tcBorders>
+            <w:tcMar>
+              <w:top w:w="60" w:type="dxa"/>
+              <w:left w:w="100" w:type="dxa"/>
+              <w:bottom w:w="60" w:type="dxa"/>
+              <w:right w:w="100" w:type="dxa"/>
+            </w:tcMar>
+            <w:hideMark/>
+          </w:tcPr>
+          <w:p>
+            <w:pPr>
+              <w:pStyle w:val="celda"/>
+              <w:rPr>
+                <w:rFonts w:ascii="Calibri" w:hAnsi="Calibri" w:cs="Calibri"/>
+                <w:color w:val="1F1A1A"/>
+                <w:sz w:val="19"/>
+                <w:szCs w:val="19"/>
+              </w:rPr>
+            </w:pPr>
+            <w:r>
+              <w:rPr>
+                <w:rFonts w:ascii="Calibri" w:hAnsi="Calibri" w:cs="Calibri"/>
+                <w:color w:val="1F1A1A"/>
+                <w:sz w:val="19"/>
+                <w:szCs w:val="19"/>
+              </w:rPr>
+              <w:t>ADR-010</w:t>
             </w:r>
           </w:p>
         </w:tc>
@@ -2309,6 +2930,160 @@
                 <w:sz w:val="19"/>
                 <w:szCs w:val="19"/>
               </w:rPr>
+              <w:t>¿Qué pasa al escanear a un alumno con falta notificada, reporte, llamada de atención o alta para prácticas?</w:t>
+            </w:r>
+          </w:p>
+        </w:tc>
+        <w:tc>
+          <w:tcPr>
+            <w:tcW w:w="0" w:type="auto"/>
+            <w:tcBorders>
+              <w:top w:val="single" w:sz="6" w:space="0" w:color="D9C9C5"/>
+              <w:left w:val="single" w:sz="6" w:space="0" w:color="D9C9C5"/>
+              <w:bottom w:val="single" w:sz="6" w:space="0" w:color="D9C9C5"/>
+              <w:right w:val="single" w:sz="6" w:space="0" w:color="D9C9C5"/>
+            </w:tcBorders>
+            <w:tcMar>
+              <w:top w:w="60" w:type="dxa"/>
+              <w:left w:w="100" w:type="dxa"/>
+              <w:bottom w:w="60" w:type="dxa"/>
+              <w:right w:w="100" w:type="dxa"/>
+            </w:tcMar>
+            <w:hideMark/>
+          </w:tcPr>
+          <w:p>
+            <w:pPr>
+              <w:pStyle w:val="celda"/>
+              <w:rPr>
+                <w:rFonts w:ascii="Calibri" w:hAnsi="Calibri" w:cs="Calibri"/>
+                <w:color w:val="1F1A1A"/>
+                <w:sz w:val="19"/>
+                <w:szCs w:val="19"/>
+              </w:rPr>
+            </w:pPr>
+            <w:r>
+              <w:rPr>
+                <w:rFonts w:ascii="Calibri" w:hAnsi="Calibri" w:cs="Calibri"/>
+                <w:color w:val="1F1A1A"/>
+                <w:sz w:val="19"/>
+                <w:szCs w:val="19"/>
+              </w:rPr>
+              <w:t>Las alertas del escaneo</w:t>
+            </w:r>
+          </w:p>
+        </w:tc>
+        <w:tc>
+          <w:tcPr>
+            <w:tcW w:w="0" w:type="auto"/>
+            <w:tcBorders>
+              <w:top w:val="single" w:sz="6" w:space="0" w:color="D9C9C5"/>
+              <w:left w:val="single" w:sz="6" w:space="0" w:color="D9C9C5"/>
+              <w:bottom w:val="single" w:sz="6" w:space="0" w:color="D9C9C5"/>
+              <w:right w:val="single" w:sz="6" w:space="0" w:color="D9C9C5"/>
+            </w:tcBorders>
+            <w:tcMar>
+              <w:top w:w="60" w:type="dxa"/>
+              <w:left w:w="100" w:type="dxa"/>
+              <w:bottom w:w="60" w:type="dxa"/>
+              <w:right w:w="100" w:type="dxa"/>
+            </w:tcMar>
+            <w:hideMark/>
+          </w:tcPr>
+          <w:p>
+            <w:pPr>
+              <w:pStyle w:val="celda"/>
+              <w:rPr>
+                <w:rFonts w:ascii="Calibri" w:hAnsi="Calibri" w:cs="Calibri"/>
+                <w:color w:val="1F1A1A"/>
+                <w:sz w:val="19"/>
+                <w:szCs w:val="19"/>
+              </w:rPr>
+            </w:pPr>
+            <w:r>
+              <w:rPr>
+                <w:rFonts w:ascii="Calibri" w:hAnsi="Calibri" w:cs="Calibri"/>
+                <w:color w:val="1F1A1A"/>
+                <w:sz w:val="19"/>
+                <w:szCs w:val="19"/>
+              </w:rPr>
+              <w:t>Hoy no generan alerta; "en prácticas" puede salir sin alerta (ADR-009)</w:t>
+            </w:r>
+          </w:p>
+        </w:tc>
+        <w:tc>
+          <w:tcPr>
+            <w:tcW w:w="0" w:type="auto"/>
+            <w:tcBorders>
+              <w:top w:val="single" w:sz="6" w:space="0" w:color="D9C9C5"/>
+              <w:left w:val="single" w:sz="6" w:space="0" w:color="D9C9C5"/>
+              <w:bottom w:val="single" w:sz="6" w:space="0" w:color="D9C9C5"/>
+              <w:right w:val="single" w:sz="6" w:space="0" w:color="D9C9C5"/>
+            </w:tcBorders>
+            <w:tcMar>
+              <w:top w:w="60" w:type="dxa"/>
+              <w:left w:w="100" w:type="dxa"/>
+              <w:bottom w:w="60" w:type="dxa"/>
+              <w:right w:w="100" w:type="dxa"/>
+            </w:tcMar>
+            <w:hideMark/>
+          </w:tcPr>
+          <w:p>
+            <w:pPr>
+              <w:pStyle w:val="celda"/>
+              <w:rPr>
+                <w:rFonts w:ascii="Calibri" w:hAnsi="Calibri" w:cs="Calibri"/>
+                <w:color w:val="1F1A1A"/>
+                <w:sz w:val="19"/>
+                <w:szCs w:val="19"/>
+              </w:rPr>
+            </w:pPr>
+            <w:r>
+              <w:rPr>
+                <w:rFonts w:ascii="Calibri" w:hAnsi="Calibri" w:cs="Calibri"/>
+                <w:color w:val="1F1A1A"/>
+                <w:sz w:val="19"/>
+                <w:szCs w:val="19"/>
+              </w:rPr>
+              <w:t>Pantallas por rol (tabla de estatus)</w:t>
+            </w:r>
+          </w:p>
+        </w:tc>
+      </w:tr>
+      <w:tr>
+        <w:tc>
+          <w:tcPr>
+            <w:tcW w:w="0" w:type="auto"/>
+            <w:tcBorders>
+              <w:top w:val="single" w:sz="6" w:space="0" w:color="D9C9C5"/>
+              <w:left w:val="single" w:sz="6" w:space="0" w:color="D9C9C5"/>
+              <w:bottom w:val="single" w:sz="6" w:space="0" w:color="D9C9C5"/>
+              <w:right w:val="single" w:sz="6" w:space="0" w:color="D9C9C5"/>
+            </w:tcBorders>
+            <w:tcMar>
+              <w:top w:w="60" w:type="dxa"/>
+              <w:left w:w="100" w:type="dxa"/>
+              <w:bottom w:w="60" w:type="dxa"/>
+              <w:right w:w="100" w:type="dxa"/>
+            </w:tcMar>
+            <w:hideMark/>
+          </w:tcPr>
+          <w:p>
+            <w:pPr>
+              <w:pStyle w:val="celda"/>
+              <w:rPr>
+                <w:rFonts w:ascii="Calibri" w:hAnsi="Calibri" w:cs="Calibri"/>
+                <w:color w:val="1F1A1A"/>
+                <w:sz w:val="19"/>
+                <w:szCs w:val="19"/>
+              </w:rPr>
+            </w:pPr>
+            <w:r>
+              <w:rPr>
+                <w:rFonts w:ascii="Calibri" w:hAnsi="Calibri" w:cs="Calibri"/>
+                <w:color w:val="1F1A1A"/>
+                <w:sz w:val="19"/>
+                <w:szCs w:val="19"/>
+              </w:rPr>
               <w:t>¿Cada cuánto vence la contraseña y a quién aplica: solo al prefecto o a todo el personal?</w:t>
             </w:r>
           </w:p>
@@ -2679,7 +3454,27 @@
                 <w:sz w:val="19"/>
                 <w:szCs w:val="19"/>
               </w:rPr>
-              <w:t>¿Enfermería trabaja solo en web?</w:t>
+              <w:t xml:space="preserve">~~¿Enfermería trabaja solo en web?~~ </w:t>
+            </w:r>
+            <w:r>
+              <w:rPr>
+                <w:rFonts w:ascii="Calibri" w:hAnsi="Calibri" w:cs="Calibri"/>
+                <w:b/>
+                <w:bCs/>
+                <w:color w:val="1F1A1A"/>
+                <w:sz w:val="19"/>
+                <w:szCs w:val="19"/>
+              </w:rPr>
+              <w:t>Sí</w:t>
+            </w:r>
+            <w:r>
+              <w:rPr>
+                <w:rFonts w:ascii="Calibri" w:hAnsi="Calibri" w:cs="Calibri"/>
+                <w:color w:val="1F1A1A"/>
+                <w:sz w:val="19"/>
+                <w:szCs w:val="19"/>
+              </w:rPr>
+              <w:t xml:space="preserve"> (el usuario, 20 oct)</w:t>
             </w:r>
           </w:p>
         </w:tc>
@@ -2755,7 +3550,7 @@
                 <w:sz w:val="19"/>
                 <w:szCs w:val="19"/>
               </w:rPr>
-              <w:t>En la app, Enfermería ve un aviso; la web está por confirmar</w:t>
+              <w:t>Enfermería usa la web (ADR-011); en la app ve un aviso</w:t>
             </w:r>
           </w:p>
         </w:tc>
@@ -2987,7 +3782,6 @@
                 <w:sz w:val="19"/>
                 <w:szCs w:val="19"/>
               </w:rPr>
-              <w:lastRenderedPageBreak/>
               <w:t>¿El alumno y el padre ven en la app si el alumno está inactivo?</w:t>
             </w:r>
           </w:p>
@@ -3124,7 +3918,7 @@
           <w:sz w:val="22"/>
           <w:szCs w:val="22"/>
         </w:rPr>
-        <w:pict w14:anchorId="7D53AF43">
+        <w:pict w14:anchorId="6266FC26">
           <v:rect id="_x0000_i1028" style="width:0;height:1.5pt" o:hralign="center" o:hrstd="t" o:hr="t" fillcolor="#a0a0a0" stroked="f"/>
         </w:pict>
       </w:r>
@@ -4295,7 +5089,7 @@
           <w:sz w:val="22"/>
           <w:szCs w:val="22"/>
         </w:rPr>
-        <w:pict w14:anchorId="0E77A3D7">
+        <w:pict w14:anchorId="23E42B0D">
           <v:rect id="_x0000_i1029" style="width:0;height:1.5pt" o:hralign="center" o:hrstd="t" o:hr="t" fillcolor="#a0a0a0" stroked="f"/>
         </w:pict>
       </w:r>
@@ -4326,9 +5120,9 @@
         <w:tblLook w:val="04A0" w:firstRow="1" w:lastRow="0" w:firstColumn="1" w:lastColumn="0" w:noHBand="0" w:noVBand="1"/>
       </w:tblPr>
       <w:tblGrid>
-        <w:gridCol w:w="2213"/>
-        <w:gridCol w:w="5691"/>
-        <w:gridCol w:w="1760"/>
+        <w:gridCol w:w="2056"/>
+        <w:gridCol w:w="5967"/>
+        <w:gridCol w:w="1641"/>
       </w:tblGrid>
       <w:tr>
         <w:tc>
@@ -4551,161 +5345,80 @@
                 <w:sz w:val="19"/>
                 <w:szCs w:val="19"/>
               </w:rPr>
-              <w:t xml:space="preserve"> y su número tiene 8 dígitos. Pasos en BASE_DE_DATOS §10.1 (lo hace el usuario en la consola)</w:t>
-            </w:r>
-          </w:p>
-        </w:tc>
-        <w:tc>
-          <w:tcPr>
-            <w:tcW w:w="0" w:type="auto"/>
-            <w:tcBorders>
-              <w:top w:val="single" w:sz="6" w:space="0" w:color="D9C9C5"/>
-              <w:left w:val="single" w:sz="6" w:space="0" w:color="D9C9C5"/>
-              <w:bottom w:val="single" w:sz="6" w:space="0" w:color="D9C9C5"/>
-              <w:right w:val="single" w:sz="6" w:space="0" w:color="D9C9C5"/>
-            </w:tcBorders>
-            <w:tcMar>
-              <w:top w:w="60" w:type="dxa"/>
-              <w:left w:w="100" w:type="dxa"/>
-              <w:bottom w:w="60" w:type="dxa"/>
-              <w:right w:w="100" w:type="dxa"/>
-            </w:tcMar>
-            <w:hideMark/>
-          </w:tcPr>
-          <w:p>
-            <w:pPr>
-              <w:pStyle w:val="celda"/>
-              <w:rPr>
-                <w:rFonts w:ascii="Calibri" w:hAnsi="Calibri" w:cs="Calibri"/>
-                <w:color w:val="1F1A1A"/>
-                <w:sz w:val="19"/>
-                <w:szCs w:val="19"/>
-              </w:rPr>
-            </w:pPr>
-            <w:r>
-              <w:rPr>
-                <w:rFonts w:ascii="Calibri" w:hAnsi="Calibri" w:cs="Calibri"/>
-                <w:color w:val="1F1A1A"/>
-                <w:sz w:val="19"/>
-                <w:szCs w:val="19"/>
-              </w:rPr>
-              <w:t>ADR-009 (acciones 4 a 6)</w:t>
-            </w:r>
-          </w:p>
-        </w:tc>
-      </w:tr>
-      <w:tr>
-        <w:tc>
-          <w:tcPr>
-            <w:tcW w:w="0" w:type="auto"/>
-            <w:tcBorders>
-              <w:top w:val="single" w:sz="6" w:space="0" w:color="D9C9C5"/>
-              <w:left w:val="single" w:sz="6" w:space="0" w:color="D9C9C5"/>
-              <w:bottom w:val="single" w:sz="6" w:space="0" w:color="D9C9C5"/>
-              <w:right w:val="single" w:sz="6" w:space="0" w:color="D9C9C5"/>
-            </w:tcBorders>
-            <w:tcMar>
-              <w:top w:w="60" w:type="dxa"/>
-              <w:left w:w="100" w:type="dxa"/>
-              <w:bottom w:w="60" w:type="dxa"/>
-              <w:right w:w="100" w:type="dxa"/>
-            </w:tcMar>
-            <w:hideMark/>
-          </w:tcPr>
-          <w:p>
-            <w:pPr>
-              <w:pStyle w:val="celda"/>
-              <w:rPr>
-                <w:rFonts w:ascii="Calibri" w:hAnsi="Calibri" w:cs="Calibri"/>
-                <w:color w:val="1F1A1A"/>
-                <w:sz w:val="19"/>
-                <w:szCs w:val="19"/>
-              </w:rPr>
-            </w:pPr>
-            <w:r>
-              <w:rPr>
-                <w:rFonts w:ascii="Calibri" w:hAnsi="Calibri" w:cs="Calibri"/>
-                <w:color w:val="1F1A1A"/>
-                <w:sz w:val="19"/>
-                <w:szCs w:val="19"/>
-              </w:rPr>
-              <w:t>"Últimos escaneos" en el Inicio del prefecto</w:t>
-            </w:r>
-          </w:p>
-        </w:tc>
-        <w:tc>
-          <w:tcPr>
-            <w:tcW w:w="0" w:type="auto"/>
-            <w:tcBorders>
-              <w:top w:val="single" w:sz="6" w:space="0" w:color="D9C9C5"/>
-              <w:left w:val="single" w:sz="6" w:space="0" w:color="D9C9C5"/>
-              <w:bottom w:val="single" w:sz="6" w:space="0" w:color="D9C9C5"/>
-              <w:right w:val="single" w:sz="6" w:space="0" w:color="D9C9C5"/>
-            </w:tcBorders>
-            <w:tcMar>
-              <w:top w:w="60" w:type="dxa"/>
-              <w:left w:w="100" w:type="dxa"/>
-              <w:bottom w:w="60" w:type="dxa"/>
-              <w:right w:w="100" w:type="dxa"/>
-            </w:tcMar>
-            <w:hideMark/>
-          </w:tcPr>
-          <w:p>
-            <w:pPr>
-              <w:pStyle w:val="celda"/>
-              <w:rPr>
-                <w:rFonts w:ascii="Calibri" w:hAnsi="Calibri" w:cs="Calibri"/>
-                <w:color w:val="1F1A1A"/>
-                <w:sz w:val="19"/>
-                <w:szCs w:val="19"/>
-              </w:rPr>
-            </w:pPr>
-            <w:r>
-              <w:rPr>
-                <w:rFonts w:ascii="Calibri" w:hAnsi="Calibri" w:cs="Calibri"/>
-                <w:color w:val="1F1A1A"/>
-                <w:sz w:val="19"/>
-                <w:szCs w:val="19"/>
-              </w:rPr>
-              <w:t>Está en Figma; hoy el Inicio muestra las salidas de grupo</w:t>
-            </w:r>
-          </w:p>
-        </w:tc>
-        <w:tc>
-          <w:tcPr>
-            <w:tcW w:w="0" w:type="auto"/>
-            <w:tcBorders>
-              <w:top w:val="single" w:sz="6" w:space="0" w:color="D9C9C5"/>
-              <w:left w:val="single" w:sz="6" w:space="0" w:color="D9C9C5"/>
-              <w:bottom w:val="single" w:sz="6" w:space="0" w:color="D9C9C5"/>
-              <w:right w:val="single" w:sz="6" w:space="0" w:color="D9C9C5"/>
-            </w:tcBorders>
-            <w:tcMar>
-              <w:top w:w="60" w:type="dxa"/>
-              <w:left w:w="100" w:type="dxa"/>
-              <w:bottom w:w="60" w:type="dxa"/>
-              <w:right w:w="100" w:type="dxa"/>
-            </w:tcMar>
-            <w:hideMark/>
-          </w:tcPr>
-          <w:p>
-            <w:pPr>
-              <w:pStyle w:val="celda"/>
-              <w:rPr>
-                <w:rFonts w:ascii="Calibri" w:hAnsi="Calibri" w:cs="Calibri"/>
-                <w:color w:val="1F1A1A"/>
-                <w:sz w:val="19"/>
-                <w:szCs w:val="19"/>
-              </w:rPr>
-            </w:pPr>
-            <w:r>
-              <w:rPr>
-                <w:rFonts w:ascii="Calibri" w:hAnsi="Calibri" w:cs="Calibri"/>
-                <w:color w:val="1F1A1A"/>
-                <w:sz w:val="19"/>
-                <w:szCs w:val="19"/>
-              </w:rPr>
-              <w:t>Figma</w:t>
+              <w:t xml:space="preserve"> y su número tiene 8 dígitos. Pasos en BASE_DE_DATOS §10.1 (lo hace el usuario en la consola). Las reglas ya incluyen lo de ADR-010. </w:t>
+            </w:r>
+            <w:r>
+              <w:rPr>
+                <w:rFonts w:ascii="Calibri" w:hAnsi="Calibri" w:cs="Calibri"/>
+                <w:b/>
+                <w:bCs/>
+                <w:color w:val="1F1A1A"/>
+                <w:sz w:val="19"/>
+                <w:szCs w:val="19"/>
+              </w:rPr>
+              <w:t>Hecho el 20 oct:</w:t>
+            </w:r>
+            <w:r>
+              <w:rPr>
+                <w:rFonts w:ascii="Calibri" w:hAnsi="Calibri" w:cs="Calibri"/>
+                <w:color w:val="1F1A1A"/>
+                <w:sz w:val="19"/>
+                <w:szCs w:val="19"/>
+              </w:rPr>
+              <w:t xml:space="preserve"> los perfiles de </w:t>
+            </w:r>
+            <w:r>
+              <w:rPr>
+                <w:rStyle w:val="HTMLCode"/>
+              </w:rPr>
+              <w:t>roles</w:t>
+            </w:r>
+            <w:r>
+              <w:rPr>
+                <w:rFonts w:ascii="Calibri" w:hAnsi="Calibri" w:cs="Calibri"/>
+                <w:color w:val="1F1A1A"/>
+                <w:sz w:val="19"/>
+                <w:szCs w:val="19"/>
+              </w:rPr>
+              <w:t xml:space="preserve"> (pasos 2 de §10.1)</w:t>
+            </w:r>
+          </w:p>
+        </w:tc>
+        <w:tc>
+          <w:tcPr>
+            <w:tcW w:w="0" w:type="auto"/>
+            <w:tcBorders>
+              <w:top w:val="single" w:sz="6" w:space="0" w:color="D9C9C5"/>
+              <w:left w:val="single" w:sz="6" w:space="0" w:color="D9C9C5"/>
+              <w:bottom w:val="single" w:sz="6" w:space="0" w:color="D9C9C5"/>
+              <w:right w:val="single" w:sz="6" w:space="0" w:color="D9C9C5"/>
+            </w:tcBorders>
+            <w:tcMar>
+              <w:top w:w="60" w:type="dxa"/>
+              <w:left w:w="100" w:type="dxa"/>
+              <w:bottom w:w="60" w:type="dxa"/>
+              <w:right w:w="100" w:type="dxa"/>
+            </w:tcMar>
+            <w:hideMark/>
+          </w:tcPr>
+          <w:p>
+            <w:pPr>
+              <w:pStyle w:val="celda"/>
+              <w:rPr>
+                <w:rFonts w:ascii="Calibri" w:hAnsi="Calibri" w:cs="Calibri"/>
+                <w:color w:val="1F1A1A"/>
+                <w:sz w:val="19"/>
+                <w:szCs w:val="19"/>
+              </w:rPr>
+            </w:pPr>
+            <w:r>
+              <w:rPr>
+                <w:rFonts w:ascii="Calibri" w:hAnsi="Calibri" w:cs="Calibri"/>
+                <w:color w:val="1F1A1A"/>
+                <w:sz w:val="19"/>
+                <w:szCs w:val="19"/>
+              </w:rPr>
+              <w:t>ADR-009 (acciones 4 a 6), ADR-010 (acciones 3 y 4)</w:t>
             </w:r>
           </w:p>
         </w:tc>
@@ -5304,16 +6017,7 @@
           <w:sz w:val="22"/>
           <w:szCs w:val="22"/>
         </w:rPr>
-        <w:t xml:space="preserve"> </w:t>
-      </w:r>
-      <w:r>
-        <w:rPr>
-          <w:rFonts w:ascii="Calibri" w:hAnsi="Calibri" w:cs="Calibri"/>
-          <w:color w:val="1F1A1A"/>
-          <w:sz w:val="22"/>
-          <w:szCs w:val="22"/>
-        </w:rPr>
-        <w:t xml:space="preserve">el </w:t>
+        <w:t xml:space="preserve"> el </w:t>
       </w:r>
       <w:r>
         <w:rPr>
@@ -5367,16 +6071,7 @@
           <w:sz w:val="22"/>
           <w:szCs w:val="22"/>
         </w:rPr>
-        <w:t>n (ya usa</w:t>
-      </w:r>
-      <w:r>
-        <w:rPr>
-          <w:rFonts w:ascii="Calibri" w:hAnsi="Calibri" w:cs="Calibri"/>
-          <w:color w:val="1F1A1A"/>
-          <w:sz w:val="22"/>
-          <w:szCs w:val="22"/>
-        </w:rPr>
-        <w:t xml:space="preserve"> </w:t>
+        <w:t xml:space="preserve">n (ya usa </w:t>
       </w:r>
       <w:r>
         <w:rPr>
@@ -5410,7 +6105,7 @@
           <w:sz w:val="22"/>
           <w:szCs w:val="22"/>
         </w:rPr>
-        <w:pict w14:anchorId="1ED52462">
+        <w:pict w14:anchorId="0354651F">
           <v:rect id="_x0000_i1030" style="width:0;height:1.5pt" o:hralign="center" o:hrstd="t" o:hr="t" fillcolor="#a0a0a0" stroked="f"/>
         </w:pict>
       </w:r>
@@ -7623,16 +8318,7 @@
           <w:sz w:val="22"/>
           <w:szCs w:val="22"/>
         </w:rPr>
-        <w:t xml:space="preserve"> </w:t>
-      </w:r>
-      <w:r>
-        <w:rPr>
-          <w:rFonts w:ascii="Calibri" w:hAnsi="Calibri" w:cs="Calibri"/>
-          <w:color w:val="1F1A1A"/>
-          <w:sz w:val="22"/>
-          <w:szCs w:val="22"/>
-        </w:rPr>
-        <w:t xml:space="preserve">el Figma de prefecto y profesor también tiene barra inferior (pestañas). En la app ya no hay barra: esas pestañas ahora son opciones del menú </w:t>
+        <w:t xml:space="preserve"> el Figma de prefecto y profesor también tiene barra inferior (pestañas). En la app ya no hay barra: esas pestañas ahora son opciones del menú </w:t>
       </w:r>
       <w:r>
         <w:rPr>
@@ -7726,16 +8412,7 @@
           <w:sz w:val="22"/>
           <w:szCs w:val="22"/>
         </w:rPr>
-        <w:t>o, para que Figma y la app coincidan. (Ya no hace falta corregir la capa</w:t>
-      </w:r>
-      <w:r>
-        <w:rPr>
-          <w:rFonts w:ascii="Calibri" w:hAnsi="Calibri" w:cs="Calibri"/>
-          <w:color w:val="1F1A1A"/>
-          <w:sz w:val="22"/>
-          <w:szCs w:val="22"/>
-        </w:rPr>
-        <w:t xml:space="preserve"> </w:t>
+        <w:t xml:space="preserve">o, para que Figma y la app coincidan. (Ya no hace falta corregir la capa </w:t>
       </w:r>
       <w:r>
         <w:rPr>
@@ -7789,7 +8466,7 @@
           <w:sz w:val="22"/>
           <w:szCs w:val="22"/>
         </w:rPr>
-        <w:pict w14:anchorId="71E17CB2">
+        <w:pict w14:anchorId="57B8101B">
           <v:rect id="_x0000_i1031" style="width:0;height:1.5pt" o:hralign="center" o:hrstd="t" o:hr="t" fillcolor="#a0a0a0" stroked="f"/>
         </w:pict>
       </w:r>
@@ -7820,9 +8497,9 @@
         <w:tblLook w:val="04A0" w:firstRow="1" w:lastRow="0" w:firstColumn="1" w:lastColumn="0" w:noHBand="0" w:noVBand="1"/>
       </w:tblPr>
       <w:tblGrid>
-        <w:gridCol w:w="1780"/>
-        <w:gridCol w:w="6132"/>
-        <w:gridCol w:w="1752"/>
+        <w:gridCol w:w="1555"/>
+        <w:gridCol w:w="6664"/>
+        <w:gridCol w:w="1445"/>
       </w:tblGrid>
       <w:tr>
         <w:tc>
@@ -8288,45 +8965,217 @@
                 <w:sz w:val="19"/>
                 <w:szCs w:val="19"/>
               </w:rPr>
-              <w:t>Con Cloud Messaging, cuando su hijo entra o sale. Depende de Cloud Functions</w:t>
-            </w:r>
-          </w:p>
-        </w:tc>
-        <w:tc>
-          <w:tcPr>
-            <w:tcW w:w="0" w:type="auto"/>
-            <w:tcBorders>
-              <w:top w:val="single" w:sz="6" w:space="0" w:color="D9C9C5"/>
-              <w:left w:val="single" w:sz="6" w:space="0" w:color="D9C9C5"/>
-              <w:bottom w:val="single" w:sz="6" w:space="0" w:color="D9C9C5"/>
-              <w:right w:val="single" w:sz="6" w:space="0" w:color="D9C9C5"/>
-            </w:tcBorders>
-            <w:tcMar>
-              <w:top w:w="60" w:type="dxa"/>
-              <w:left w:w="100" w:type="dxa"/>
-              <w:bottom w:w="60" w:type="dxa"/>
-              <w:right w:w="100" w:type="dxa"/>
-            </w:tcMar>
-            <w:hideMark/>
-          </w:tcPr>
-          <w:p>
-            <w:pPr>
-              <w:pStyle w:val="celda"/>
-              <w:rPr>
-                <w:rFonts w:ascii="Calibri" w:hAnsi="Calibri" w:cs="Calibri"/>
-                <w:color w:val="1F1A1A"/>
-                <w:sz w:val="19"/>
-                <w:szCs w:val="19"/>
-              </w:rPr>
-            </w:pPr>
-            <w:r>
-              <w:rPr>
-                <w:rFonts w:ascii="Calibri" w:hAnsi="Calibri" w:cs="Calibri"/>
-                <w:color w:val="1F1A1A"/>
-                <w:sz w:val="19"/>
-                <w:szCs w:val="19"/>
-              </w:rPr>
-              <w:t>ADR-002 (acción 4), base de datos §11</w:t>
+              <w:t xml:space="preserve">Con Cloud Messaging. Ya todo llega al buzón </w:t>
+            </w:r>
+            <w:r>
+              <w:rPr>
+                <w:rStyle w:val="HTMLCode"/>
+              </w:rPr>
+              <w:t>usuarios/{uid}/notificaciones</w:t>
+            </w:r>
+            <w:r>
+              <w:rPr>
+                <w:rFonts w:ascii="Calibri" w:hAnsi="Calibri" w:cs="Calibri"/>
+                <w:color w:val="1F1A1A"/>
+                <w:sz w:val="19"/>
+                <w:szCs w:val="19"/>
+              </w:rPr>
+              <w:t xml:space="preserve"> (ADR-010): basta una Cloud Function que escuche ese buzón y mande el push a </w:t>
+            </w:r>
+            <w:r>
+              <w:rPr>
+                <w:rStyle w:val="HTMLCode"/>
+              </w:rPr>
+              <w:t>tokensFcm</w:t>
+            </w:r>
+            <w:r>
+              <w:rPr>
+                <w:rFonts w:ascii="Calibri" w:hAnsi="Calibri" w:cs="Calibri"/>
+                <w:color w:val="1F1A1A"/>
+                <w:sz w:val="19"/>
+                <w:szCs w:val="19"/>
+              </w:rPr>
+              <w:t>. Depende de Cloud Functions</w:t>
+            </w:r>
+          </w:p>
+        </w:tc>
+        <w:tc>
+          <w:tcPr>
+            <w:tcW w:w="0" w:type="auto"/>
+            <w:tcBorders>
+              <w:top w:val="single" w:sz="6" w:space="0" w:color="D9C9C5"/>
+              <w:left w:val="single" w:sz="6" w:space="0" w:color="D9C9C5"/>
+              <w:bottom w:val="single" w:sz="6" w:space="0" w:color="D9C9C5"/>
+              <w:right w:val="single" w:sz="6" w:space="0" w:color="D9C9C5"/>
+            </w:tcBorders>
+            <w:tcMar>
+              <w:top w:w="60" w:type="dxa"/>
+              <w:left w:w="100" w:type="dxa"/>
+              <w:bottom w:w="60" w:type="dxa"/>
+              <w:right w:w="100" w:type="dxa"/>
+            </w:tcMar>
+            <w:hideMark/>
+          </w:tcPr>
+          <w:p>
+            <w:pPr>
+              <w:pStyle w:val="celda"/>
+              <w:rPr>
+                <w:rFonts w:ascii="Calibri" w:hAnsi="Calibri" w:cs="Calibri"/>
+                <w:color w:val="1F1A1A"/>
+                <w:sz w:val="19"/>
+                <w:szCs w:val="19"/>
+              </w:rPr>
+            </w:pPr>
+            <w:r>
+              <w:rPr>
+                <w:rFonts w:ascii="Calibri" w:hAnsi="Calibri" w:cs="Calibri"/>
+                <w:color w:val="1F1A1A"/>
+                <w:sz w:val="19"/>
+                <w:szCs w:val="19"/>
+              </w:rPr>
+              <w:t>ADR-002 (acción 4), ADR-010 (acción 8)</w:t>
+            </w:r>
+          </w:p>
+        </w:tc>
+      </w:tr>
+      <w:tr>
+        <w:tc>
+          <w:tcPr>
+            <w:tcW w:w="0" w:type="auto"/>
+            <w:tcBorders>
+              <w:top w:val="single" w:sz="6" w:space="0" w:color="D9C9C5"/>
+              <w:left w:val="single" w:sz="6" w:space="0" w:color="D9C9C5"/>
+              <w:bottom w:val="single" w:sz="6" w:space="0" w:color="D9C9C5"/>
+              <w:right w:val="single" w:sz="6" w:space="0" w:color="D9C9C5"/>
+            </w:tcBorders>
+            <w:tcMar>
+              <w:top w:w="60" w:type="dxa"/>
+              <w:left w:w="100" w:type="dxa"/>
+              <w:bottom w:w="60" w:type="dxa"/>
+              <w:right w:w="100" w:type="dxa"/>
+            </w:tcMar>
+            <w:hideMark/>
+          </w:tcPr>
+          <w:p>
+            <w:pPr>
+              <w:pStyle w:val="celda"/>
+              <w:rPr>
+                <w:rFonts w:ascii="Calibri" w:hAnsi="Calibri" w:cs="Calibri"/>
+                <w:color w:val="1F1A1A"/>
+                <w:sz w:val="19"/>
+                <w:szCs w:val="19"/>
+              </w:rPr>
+            </w:pPr>
+            <w:r>
+              <w:rPr>
+                <w:rFonts w:ascii="Calibri" w:hAnsi="Calibri" w:cs="Calibri"/>
+                <w:b/>
+                <w:bCs/>
+                <w:color w:val="1F1A1A"/>
+                <w:sz w:val="19"/>
+                <w:szCs w:val="19"/>
+              </w:rPr>
+              <w:t>Borrar los avisos vencidos</w:t>
+            </w:r>
+          </w:p>
+        </w:tc>
+        <w:tc>
+          <w:tcPr>
+            <w:tcW w:w="0" w:type="auto"/>
+            <w:tcBorders>
+              <w:top w:val="single" w:sz="6" w:space="0" w:color="D9C9C5"/>
+              <w:left w:val="single" w:sz="6" w:space="0" w:color="D9C9C5"/>
+              <w:bottom w:val="single" w:sz="6" w:space="0" w:color="D9C9C5"/>
+              <w:right w:val="single" w:sz="6" w:space="0" w:color="D9C9C5"/>
+            </w:tcBorders>
+            <w:tcMar>
+              <w:top w:w="60" w:type="dxa"/>
+              <w:left w:w="100" w:type="dxa"/>
+              <w:bottom w:w="60" w:type="dxa"/>
+              <w:right w:w="100" w:type="dxa"/>
+            </w:tcMar>
+            <w:hideMark/>
+          </w:tcPr>
+          <w:p>
+            <w:pPr>
+              <w:pStyle w:val="celda"/>
+              <w:rPr>
+                <w:rFonts w:ascii="Calibri" w:hAnsi="Calibri" w:cs="Calibri"/>
+                <w:color w:val="1F1A1A"/>
+                <w:sz w:val="19"/>
+                <w:szCs w:val="19"/>
+              </w:rPr>
+            </w:pPr>
+            <w:r>
+              <w:rPr>
+                <w:rFonts w:ascii="Calibri" w:hAnsi="Calibri" w:cs="Calibri"/>
+                <w:color w:val="1F1A1A"/>
+                <w:sz w:val="19"/>
+                <w:szCs w:val="19"/>
+              </w:rPr>
+              <w:t xml:space="preserve">Cada aviso trae </w:t>
+            </w:r>
+            <w:r>
+              <w:rPr>
+                <w:rStyle w:val="HTMLCode"/>
+              </w:rPr>
+              <w:t>venceEn</w:t>
+            </w:r>
+            <w:r>
+              <w:rPr>
+                <w:rFonts w:ascii="Calibri" w:hAnsi="Calibri" w:cs="Calibri"/>
+                <w:color w:val="1F1A1A"/>
+                <w:sz w:val="19"/>
+                <w:szCs w:val="19"/>
+              </w:rPr>
+              <w:t xml:space="preserve"> </w:t>
+            </w:r>
+            <w:r>
+              <w:rPr>
+                <w:rFonts w:ascii="Calibri" w:hAnsi="Calibri" w:cs="Calibri"/>
+                <w:color w:val="1F1A1A"/>
+                <w:sz w:val="19"/>
+                <w:szCs w:val="19"/>
+              </w:rPr>
+              <w:t>(60 días). Activar una política TTL sobre ese campo si la consola lo permite; si no, con una Cloud Function o desde la web</w:t>
+            </w:r>
+          </w:p>
+        </w:tc>
+        <w:tc>
+          <w:tcPr>
+            <w:tcW w:w="0" w:type="auto"/>
+            <w:tcBorders>
+              <w:top w:val="single" w:sz="6" w:space="0" w:color="D9C9C5"/>
+              <w:left w:val="single" w:sz="6" w:space="0" w:color="D9C9C5"/>
+              <w:bottom w:val="single" w:sz="6" w:space="0" w:color="D9C9C5"/>
+              <w:right w:val="single" w:sz="6" w:space="0" w:color="D9C9C5"/>
+            </w:tcBorders>
+            <w:tcMar>
+              <w:top w:w="60" w:type="dxa"/>
+              <w:left w:w="100" w:type="dxa"/>
+              <w:bottom w:w="60" w:type="dxa"/>
+              <w:right w:w="100" w:type="dxa"/>
+            </w:tcMar>
+            <w:hideMark/>
+          </w:tcPr>
+          <w:p>
+            <w:pPr>
+              <w:pStyle w:val="celda"/>
+              <w:rPr>
+                <w:rFonts w:ascii="Calibri" w:hAnsi="Calibri" w:cs="Calibri"/>
+                <w:color w:val="1F1A1A"/>
+                <w:sz w:val="19"/>
+                <w:szCs w:val="19"/>
+              </w:rPr>
+            </w:pPr>
+            <w:r>
+              <w:rPr>
+                <w:rFonts w:ascii="Calibri" w:hAnsi="Calibri" w:cs="Calibri"/>
+                <w:color w:val="1F1A1A"/>
+                <w:sz w:val="19"/>
+                <w:szCs w:val="19"/>
+              </w:rPr>
+              <w:t>ADR-010 (acción 6)</w:t>
             </w:r>
           </w:p>
         </w:tc>
@@ -8464,7 +9313,7 @@
           <w:sz w:val="22"/>
           <w:szCs w:val="22"/>
         </w:rPr>
-        <w:pict w14:anchorId="7279A23C">
+        <w:pict w14:anchorId="4B4EBE57">
           <v:rect id="_x0000_i1032" style="width:0;height:1.5pt" o:hralign="center" o:hrstd="t" o:hr="t" fillcolor="#a0a0a0" stroked="f"/>
         </w:pict>
       </w:r>
@@ -8496,11 +9345,77 @@
       <w:r>
         <w:rPr>
           <w:rFonts w:ascii="Calibri" w:hAnsi="Calibri" w:cs="Calibri"/>
-          <w:color w:val="1F1A1A"/>
-          <w:sz w:val="22"/>
-          <w:szCs w:val="22"/>
-        </w:rPr>
-        <w:t>No existe todavía (se haría con Firebase Hosting). Mientras, los datos se dan de alta desde la consola de Firebase con las recetas de la base de datos (§9).</w:t>
+          <w:b/>
+          <w:bCs/>
+          <w:color w:val="1F1A1A"/>
+          <w:sz w:val="22"/>
+          <w:szCs w:val="22"/>
+        </w:rPr>
+        <w:t>Primera versión hecha el 20 de octubre</w:t>
+      </w:r>
+      <w:r>
+        <w:rPr>
+          <w:rFonts w:ascii="Calibri" w:hAnsi="Calibri" w:cs="Calibri"/>
+          <w:color w:val="1F1A1A"/>
+          <w:sz w:val="22"/>
+          <w:szCs w:val="22"/>
+        </w:rPr>
+        <w:t xml:space="preserve"> (ADR-011, carpeta </w:t>
+      </w:r>
+      <w:r>
+        <w:rPr>
+          <w:rStyle w:val="HTMLCode"/>
+        </w:rPr>
+        <w:t>web/</w:t>
+      </w:r>
+      <w:r>
+        <w:rPr>
+          <w:rFonts w:ascii="Calibri" w:hAnsi="Calibri" w:cs="Calibri"/>
+          <w:color w:val="1F1A1A"/>
+          <w:sz w:val="22"/>
+          <w:szCs w:val="22"/>
+        </w:rPr>
+        <w:t xml:space="preserve">, cómo usarla en </w:t>
+      </w:r>
+      <w:hyperlink r:id="rId6" w:history="1">
+        <w:r>
+          <w:rPr>
+            <w:rStyle w:val="Hyperlink"/>
+            <w:rFonts w:ascii="Calibri" w:hAnsi="Calibri" w:cs="Calibri"/>
+            <w:sz w:val="22"/>
+            <w:szCs w:val="22"/>
+          </w:rPr>
+          <w:t>web/README.md</w:t>
+        </w:r>
+      </w:hyperlink>
+      <w:r>
+        <w:rPr>
+          <w:rFonts w:ascii="Calibri" w:hAnsi="Calibri" w:cs="Calibri"/>
+          <w:color w:val="1F1A1A"/>
+          <w:sz w:val="22"/>
+          <w:szCs w:val="22"/>
+        </w:rPr>
+        <w:t xml:space="preserve">): acceso, alumnos (búsqueda y por grupo), perfil, pase de salud, activar/desactivar por salud y por pago, nuevo estatus, datos de salud, entradas y salidas del día, avisos al padre y notificaciones. Falta </w:t>
+      </w:r>
+      <w:r>
+        <w:rPr>
+          <w:rFonts w:ascii="Calibri" w:hAnsi="Calibri" w:cs="Calibri"/>
+          <w:b/>
+          <w:bCs/>
+          <w:color w:val="1F1A1A"/>
+          <w:sz w:val="22"/>
+          <w:szCs w:val="22"/>
+        </w:rPr>
+        <w:t>publicarla</w:t>
+      </w:r>
+      <w:r>
+        <w:rPr>
+          <w:rFonts w:ascii="Calibri" w:hAnsi="Calibri" w:cs="Calibri"/>
+          <w:color w:val="1F1A1A"/>
+          <w:sz w:val="22"/>
+          <w:szCs w:val="22"/>
+        </w:rPr>
+        <w:t xml:space="preserve"> (§1, punto 5).</w:t>
       </w:r>
     </w:p>
     <w:p>
@@ -8520,7 +9435,671 @@
           <w:sz w:val="22"/>
           <w:szCs w:val="22"/>
         </w:rPr>
-        <w:t xml:space="preserve">Todas sus pantallas están pendientes de programar. Estas, además, </w:t>
+        <w:t>Lo que falta en la web:</w:t>
+      </w:r>
+    </w:p>
+    <w:tbl>
+      <w:tblPr>
+        <w:tblW w:w="5000" w:type="pct"/>
+        <w:tblCellMar>
+          <w:top w:w="15" w:type="dxa"/>
+          <w:left w:w="15" w:type="dxa"/>
+          <w:bottom w:w="15" w:type="dxa"/>
+          <w:right w:w="15" w:type="dxa"/>
+        </w:tblCellMar>
+        <w:tblLook w:val="04A0" w:firstRow="1" w:lastRow="0" w:firstColumn="1" w:lastColumn="0" w:noHBand="0" w:noVBand="1"/>
+      </w:tblPr>
+      <w:tblGrid>
+        <w:gridCol w:w="998"/>
+        <w:gridCol w:w="1747"/>
+        <w:gridCol w:w="6919"/>
+      </w:tblGrid>
+      <w:tr>
+        <w:tc>
+          <w:tcPr>
+            <w:tcW w:w="0" w:type="auto"/>
+            <w:tcBorders>
+              <w:top w:val="single" w:sz="6" w:space="0" w:color="D9C9C5"/>
+              <w:left w:val="single" w:sz="6" w:space="0" w:color="D9C9C5"/>
+              <w:bottom w:val="single" w:sz="6" w:space="0" w:color="D9C9C5"/>
+              <w:right w:val="single" w:sz="6" w:space="0" w:color="D9C9C5"/>
+            </w:tcBorders>
+            <w:shd w:val="clear" w:color="auto" w:fill="EDE5E1"/>
+            <w:tcMar>
+              <w:top w:w="60" w:type="dxa"/>
+              <w:left w:w="100" w:type="dxa"/>
+              <w:bottom w:w="60" w:type="dxa"/>
+              <w:right w:w="100" w:type="dxa"/>
+            </w:tcMar>
+            <w:hideMark/>
+          </w:tcPr>
+          <w:p>
+            <w:pPr>
+              <w:pStyle w:val="celda"/>
+              <w:rPr>
+                <w:rFonts w:ascii="Calibri" w:hAnsi="Calibri" w:cs="Calibri"/>
+                <w:b/>
+                <w:bCs/>
+                <w:color w:val="461419"/>
+                <w:sz w:val="19"/>
+                <w:szCs w:val="19"/>
+              </w:rPr>
+            </w:pPr>
+            <w:r>
+              <w:rPr>
+                <w:rFonts w:ascii="Calibri" w:hAnsi="Calibri" w:cs="Calibri"/>
+                <w:b/>
+                <w:bCs/>
+                <w:color w:val="461419"/>
+                <w:sz w:val="19"/>
+                <w:szCs w:val="19"/>
+              </w:rPr>
+              <w:t>Rol</w:t>
+            </w:r>
+          </w:p>
+        </w:tc>
+        <w:tc>
+          <w:tcPr>
+            <w:tcW w:w="0" w:type="auto"/>
+            <w:tcBorders>
+              <w:top w:val="single" w:sz="6" w:space="0" w:color="D9C9C5"/>
+              <w:left w:val="single" w:sz="6" w:space="0" w:color="D9C9C5"/>
+              <w:bottom w:val="single" w:sz="6" w:space="0" w:color="D9C9C5"/>
+              <w:right w:val="single" w:sz="6" w:space="0" w:color="D9C9C5"/>
+            </w:tcBorders>
+            <w:shd w:val="clear" w:color="auto" w:fill="EDE5E1"/>
+            <w:tcMar>
+              <w:top w:w="60" w:type="dxa"/>
+              <w:left w:w="100" w:type="dxa"/>
+              <w:bottom w:w="60" w:type="dxa"/>
+              <w:right w:w="100" w:type="dxa"/>
+            </w:tcMar>
+            <w:hideMark/>
+          </w:tcPr>
+          <w:p>
+            <w:pPr>
+              <w:pStyle w:val="celda"/>
+              <w:rPr>
+                <w:rFonts w:ascii="Calibri" w:hAnsi="Calibri" w:cs="Calibri"/>
+                <w:b/>
+                <w:bCs/>
+                <w:color w:val="461419"/>
+                <w:sz w:val="19"/>
+                <w:szCs w:val="19"/>
+              </w:rPr>
+            </w:pPr>
+            <w:r>
+              <w:rPr>
+                <w:rFonts w:ascii="Calibri" w:hAnsi="Calibri" w:cs="Calibri"/>
+                <w:b/>
+                <w:bCs/>
+                <w:color w:val="461419"/>
+                <w:sz w:val="19"/>
+                <w:szCs w:val="19"/>
+              </w:rPr>
+              <w:t>Pendiente</w:t>
+            </w:r>
+          </w:p>
+        </w:tc>
+        <w:tc>
+          <w:tcPr>
+            <w:tcW w:w="0" w:type="auto"/>
+            <w:tcBorders>
+              <w:top w:val="single" w:sz="6" w:space="0" w:color="D9C9C5"/>
+              <w:left w:val="single" w:sz="6" w:space="0" w:color="D9C9C5"/>
+              <w:bottom w:val="single" w:sz="6" w:space="0" w:color="D9C9C5"/>
+              <w:right w:val="single" w:sz="6" w:space="0" w:color="D9C9C5"/>
+            </w:tcBorders>
+            <w:shd w:val="clear" w:color="auto" w:fill="EDE5E1"/>
+            <w:tcMar>
+              <w:top w:w="60" w:type="dxa"/>
+              <w:left w:w="100" w:type="dxa"/>
+              <w:bottom w:w="60" w:type="dxa"/>
+              <w:right w:w="100" w:type="dxa"/>
+            </w:tcMar>
+            <w:hideMark/>
+          </w:tcPr>
+          <w:p>
+            <w:pPr>
+              <w:pStyle w:val="celda"/>
+              <w:rPr>
+                <w:rFonts w:ascii="Calibri" w:hAnsi="Calibri" w:cs="Calibri"/>
+                <w:b/>
+                <w:bCs/>
+                <w:color w:val="461419"/>
+                <w:sz w:val="19"/>
+                <w:szCs w:val="19"/>
+              </w:rPr>
+            </w:pPr>
+            <w:r>
+              <w:rPr>
+                <w:rFonts w:ascii="Calibri" w:hAnsi="Calibri" w:cs="Calibri"/>
+                <w:b/>
+                <w:bCs/>
+                <w:color w:val="461419"/>
+                <w:sz w:val="19"/>
+                <w:szCs w:val="19"/>
+              </w:rPr>
+              <w:t>Detalle</w:t>
+            </w:r>
+          </w:p>
+        </w:tc>
+      </w:tr>
+      <w:tr>
+        <w:tc>
+          <w:tcPr>
+            <w:tcW w:w="0" w:type="auto"/>
+            <w:tcBorders>
+              <w:top w:val="single" w:sz="6" w:space="0" w:color="D9C9C5"/>
+              <w:left w:val="single" w:sz="6" w:space="0" w:color="D9C9C5"/>
+              <w:bottom w:val="single" w:sz="6" w:space="0" w:color="D9C9C5"/>
+              <w:right w:val="single" w:sz="6" w:space="0" w:color="D9C9C5"/>
+            </w:tcBorders>
+            <w:tcMar>
+              <w:top w:w="60" w:type="dxa"/>
+              <w:left w:w="100" w:type="dxa"/>
+              <w:bottom w:w="60" w:type="dxa"/>
+              <w:right w:w="100" w:type="dxa"/>
+            </w:tcMar>
+            <w:hideMark/>
+          </w:tcPr>
+          <w:p>
+            <w:pPr>
+              <w:pStyle w:val="celda"/>
+              <w:rPr>
+                <w:rFonts w:ascii="Calibri" w:hAnsi="Calibri" w:cs="Calibri"/>
+                <w:color w:val="1F1A1A"/>
+                <w:sz w:val="19"/>
+                <w:szCs w:val="19"/>
+              </w:rPr>
+            </w:pPr>
+            <w:r>
+              <w:rPr>
+                <w:rFonts w:ascii="Calibri" w:hAnsi="Calibri" w:cs="Calibri"/>
+                <w:color w:val="1F1A1A"/>
+                <w:sz w:val="19"/>
+                <w:szCs w:val="19"/>
+              </w:rPr>
+              <w:t>Control Escolar</w:t>
+            </w:r>
+          </w:p>
+        </w:tc>
+        <w:tc>
+          <w:tcPr>
+            <w:tcW w:w="0" w:type="auto"/>
+            <w:tcBorders>
+              <w:top w:val="single" w:sz="6" w:space="0" w:color="D9C9C5"/>
+              <w:left w:val="single" w:sz="6" w:space="0" w:color="D9C9C5"/>
+              <w:bottom w:val="single" w:sz="6" w:space="0" w:color="D9C9C5"/>
+              <w:right w:val="single" w:sz="6" w:space="0" w:color="D9C9C5"/>
+            </w:tcBorders>
+            <w:tcMar>
+              <w:top w:w="60" w:type="dxa"/>
+              <w:left w:w="100" w:type="dxa"/>
+              <w:bottom w:w="60" w:type="dxa"/>
+              <w:right w:w="100" w:type="dxa"/>
+            </w:tcMar>
+            <w:hideMark/>
+          </w:tcPr>
+          <w:p>
+            <w:pPr>
+              <w:pStyle w:val="celda"/>
+              <w:rPr>
+                <w:rFonts w:ascii="Calibri" w:hAnsi="Calibri" w:cs="Calibri"/>
+                <w:color w:val="1F1A1A"/>
+                <w:sz w:val="19"/>
+                <w:szCs w:val="19"/>
+              </w:rPr>
+            </w:pPr>
+            <w:r>
+              <w:rPr>
+                <w:rFonts w:ascii="Calibri" w:hAnsi="Calibri" w:cs="Calibri"/>
+                <w:b/>
+                <w:bCs/>
+                <w:color w:val="1F1A1A"/>
+                <w:sz w:val="19"/>
+                <w:szCs w:val="19"/>
+              </w:rPr>
+              <w:t>Alta de alumnos, padres y personal</w:t>
+            </w:r>
+          </w:p>
+        </w:tc>
+        <w:tc>
+          <w:tcPr>
+            <w:tcW w:w="0" w:type="auto"/>
+            <w:tcBorders>
+              <w:top w:val="single" w:sz="6" w:space="0" w:color="D9C9C5"/>
+              <w:left w:val="single" w:sz="6" w:space="0" w:color="D9C9C5"/>
+              <w:bottom w:val="single" w:sz="6" w:space="0" w:color="D9C9C5"/>
+              <w:right w:val="single" w:sz="6" w:space="0" w:color="D9C9C5"/>
+            </w:tcBorders>
+            <w:tcMar>
+              <w:top w:w="60" w:type="dxa"/>
+              <w:left w:w="100" w:type="dxa"/>
+              <w:bottom w:w="60" w:type="dxa"/>
+              <w:right w:w="100" w:type="dxa"/>
+            </w:tcMar>
+            <w:hideMark/>
+          </w:tcPr>
+          <w:p>
+            <w:pPr>
+              <w:pStyle w:val="celda"/>
+              <w:rPr>
+                <w:rFonts w:ascii="Calibri" w:hAnsi="Calibri" w:cs="Calibri"/>
+                <w:color w:val="1F1A1A"/>
+                <w:sz w:val="19"/>
+                <w:szCs w:val="19"/>
+              </w:rPr>
+            </w:pPr>
+            <w:r>
+              <w:rPr>
+                <w:rFonts w:ascii="Calibri" w:hAnsi="Calibri" w:cs="Calibri"/>
+                <w:color w:val="1F1A1A"/>
+                <w:sz w:val="19"/>
+                <w:szCs w:val="19"/>
+              </w:rPr>
+              <w:t>La web no puede crear cuentas de Authentication sin un servidor: hace falta el script de administración con el Admin SDK (ARQUITECTURA.md E1), que también sirve para la importación masiva (§9)</w:t>
+            </w:r>
+          </w:p>
+        </w:tc>
+      </w:tr>
+      <w:tr>
+        <w:tc>
+          <w:tcPr>
+            <w:tcW w:w="0" w:type="auto"/>
+            <w:tcBorders>
+              <w:top w:val="single" w:sz="6" w:space="0" w:color="D9C9C5"/>
+              <w:left w:val="single" w:sz="6" w:space="0" w:color="D9C9C5"/>
+              <w:bottom w:val="single" w:sz="6" w:space="0" w:color="D9C9C5"/>
+              <w:right w:val="single" w:sz="6" w:space="0" w:color="D9C9C5"/>
+            </w:tcBorders>
+            <w:tcMar>
+              <w:top w:w="60" w:type="dxa"/>
+              <w:left w:w="100" w:type="dxa"/>
+              <w:bottom w:w="60" w:type="dxa"/>
+              <w:right w:w="100" w:type="dxa"/>
+            </w:tcMar>
+            <w:hideMark/>
+          </w:tcPr>
+          <w:p>
+            <w:pPr>
+              <w:pStyle w:val="celda"/>
+              <w:rPr>
+                <w:rFonts w:ascii="Calibri" w:hAnsi="Calibri" w:cs="Calibri"/>
+                <w:color w:val="1F1A1A"/>
+                <w:sz w:val="19"/>
+                <w:szCs w:val="19"/>
+              </w:rPr>
+            </w:pPr>
+            <w:r>
+              <w:rPr>
+                <w:rFonts w:ascii="Calibri" w:hAnsi="Calibri" w:cs="Calibri"/>
+                <w:color w:val="1F1A1A"/>
+                <w:sz w:val="19"/>
+                <w:szCs w:val="19"/>
+              </w:rPr>
+              <w:t>Control Escolar</w:t>
+            </w:r>
+          </w:p>
+        </w:tc>
+        <w:tc>
+          <w:tcPr>
+            <w:tcW w:w="0" w:type="auto"/>
+            <w:tcBorders>
+              <w:top w:val="single" w:sz="6" w:space="0" w:color="D9C9C5"/>
+              <w:left w:val="single" w:sz="6" w:space="0" w:color="D9C9C5"/>
+              <w:bottom w:val="single" w:sz="6" w:space="0" w:color="D9C9C5"/>
+              <w:right w:val="single" w:sz="6" w:space="0" w:color="D9C9C5"/>
+            </w:tcBorders>
+            <w:tcMar>
+              <w:top w:w="60" w:type="dxa"/>
+              <w:left w:w="100" w:type="dxa"/>
+              <w:bottom w:w="60" w:type="dxa"/>
+              <w:right w:w="100" w:type="dxa"/>
+            </w:tcMar>
+            <w:hideMark/>
+          </w:tcPr>
+          <w:p>
+            <w:pPr>
+              <w:pStyle w:val="celda"/>
+              <w:rPr>
+                <w:rFonts w:ascii="Calibri" w:hAnsi="Calibri" w:cs="Calibri"/>
+                <w:color w:val="1F1A1A"/>
+                <w:sz w:val="19"/>
+                <w:szCs w:val="19"/>
+              </w:rPr>
+            </w:pPr>
+            <w:r>
+              <w:rPr>
+                <w:rFonts w:ascii="Calibri" w:hAnsi="Calibri" w:cs="Calibri"/>
+                <w:color w:val="1F1A1A"/>
+                <w:sz w:val="19"/>
+                <w:szCs w:val="19"/>
+              </w:rPr>
+              <w:t>Editar datos del alumno</w:t>
+            </w:r>
+          </w:p>
+        </w:tc>
+        <w:tc>
+          <w:tcPr>
+            <w:tcW w:w="0" w:type="auto"/>
+            <w:tcBorders>
+              <w:top w:val="single" w:sz="6" w:space="0" w:color="D9C9C5"/>
+              <w:left w:val="single" w:sz="6" w:space="0" w:color="D9C9C5"/>
+              <w:bottom w:val="single" w:sz="6" w:space="0" w:color="D9C9C5"/>
+              <w:right w:val="single" w:sz="6" w:space="0" w:color="D9C9C5"/>
+            </w:tcBorders>
+            <w:tcMar>
+              <w:top w:w="60" w:type="dxa"/>
+              <w:left w:w="100" w:type="dxa"/>
+              <w:bottom w:w="60" w:type="dxa"/>
+              <w:right w:w="100" w:type="dxa"/>
+            </w:tcMar>
+            <w:hideMark/>
+          </w:tcPr>
+          <w:p>
+            <w:pPr>
+              <w:pStyle w:val="celda"/>
+              <w:rPr>
+                <w:rFonts w:ascii="Calibri" w:hAnsi="Calibri" w:cs="Calibri"/>
+                <w:color w:val="1F1A1A"/>
+                <w:sz w:val="19"/>
+                <w:szCs w:val="19"/>
+              </w:rPr>
+            </w:pPr>
+            <w:r>
+              <w:rPr>
+                <w:rFonts w:ascii="Calibri" w:hAnsi="Calibri" w:cs="Calibri"/>
+                <w:color w:val="1F1A1A"/>
+                <w:sz w:val="19"/>
+                <w:szCs w:val="19"/>
+              </w:rPr>
+              <w:t>Hoy solo se ven; al editar el nombre hay que cambiar las dos copias (</w:t>
+            </w:r>
+            <w:r>
+              <w:rPr>
+                <w:rStyle w:val="HTMLCode"/>
+              </w:rPr>
+              <w:t>alumnos</w:t>
+            </w:r>
+            <w:r>
+              <w:rPr>
+                <w:rFonts w:ascii="Calibri" w:hAnsi="Calibri" w:cs="Calibri"/>
+                <w:color w:val="1F1A1A"/>
+                <w:sz w:val="19"/>
+                <w:szCs w:val="19"/>
+              </w:rPr>
+              <w:t xml:space="preserve"> y </w:t>
+            </w:r>
+            <w:r>
+              <w:rPr>
+                <w:rStyle w:val="HTMLCode"/>
+              </w:rPr>
+              <w:t>usuarios</w:t>
+            </w:r>
+            <w:r>
+              <w:rPr>
+                <w:rFonts w:ascii="Calibri" w:hAnsi="Calibri" w:cs="Calibri"/>
+                <w:color w:val="1F1A1A"/>
+                <w:sz w:val="19"/>
+                <w:szCs w:val="19"/>
+              </w:rPr>
+              <w:t>)</w:t>
+            </w:r>
+          </w:p>
+        </w:tc>
+      </w:tr>
+      <w:tr>
+        <w:tc>
+          <w:tcPr>
+            <w:tcW w:w="0" w:type="auto"/>
+            <w:tcBorders>
+              <w:top w:val="single" w:sz="6" w:space="0" w:color="D9C9C5"/>
+              <w:left w:val="single" w:sz="6" w:space="0" w:color="D9C9C5"/>
+              <w:bottom w:val="single" w:sz="6" w:space="0" w:color="D9C9C5"/>
+              <w:right w:val="single" w:sz="6" w:space="0" w:color="D9C9C5"/>
+            </w:tcBorders>
+            <w:tcMar>
+              <w:top w:w="60" w:type="dxa"/>
+              <w:left w:w="100" w:type="dxa"/>
+              <w:bottom w:w="60" w:type="dxa"/>
+              <w:right w:w="100" w:type="dxa"/>
+            </w:tcMar>
+            <w:hideMark/>
+          </w:tcPr>
+          <w:p>
+            <w:pPr>
+              <w:pStyle w:val="celda"/>
+              <w:rPr>
+                <w:rFonts w:ascii="Calibri" w:hAnsi="Calibri" w:cs="Calibri"/>
+                <w:color w:val="1F1A1A"/>
+                <w:sz w:val="19"/>
+                <w:szCs w:val="19"/>
+              </w:rPr>
+            </w:pPr>
+            <w:r>
+              <w:rPr>
+                <w:rFonts w:ascii="Calibri" w:hAnsi="Calibri" w:cs="Calibri"/>
+                <w:color w:val="1F1A1A"/>
+                <w:sz w:val="19"/>
+                <w:szCs w:val="19"/>
+              </w:rPr>
+              <w:t>Control Escolar</w:t>
+            </w:r>
+          </w:p>
+        </w:tc>
+        <w:tc>
+          <w:tcPr>
+            <w:tcW w:w="0" w:type="auto"/>
+            <w:tcBorders>
+              <w:top w:val="single" w:sz="6" w:space="0" w:color="D9C9C5"/>
+              <w:left w:val="single" w:sz="6" w:space="0" w:color="D9C9C5"/>
+              <w:bottom w:val="single" w:sz="6" w:space="0" w:color="D9C9C5"/>
+              <w:right w:val="single" w:sz="6" w:space="0" w:color="D9C9C5"/>
+            </w:tcBorders>
+            <w:tcMar>
+              <w:top w:w="60" w:type="dxa"/>
+              <w:left w:w="100" w:type="dxa"/>
+              <w:bottom w:w="60" w:type="dxa"/>
+              <w:right w:w="100" w:type="dxa"/>
+            </w:tcMar>
+            <w:hideMark/>
+          </w:tcPr>
+          <w:p>
+            <w:pPr>
+              <w:pStyle w:val="celda"/>
+              <w:rPr>
+                <w:rFonts w:ascii="Calibri" w:hAnsi="Calibri" w:cs="Calibri"/>
+                <w:color w:val="1F1A1A"/>
+                <w:sz w:val="19"/>
+                <w:szCs w:val="19"/>
+              </w:rPr>
+            </w:pPr>
+            <w:r>
+              <w:rPr>
+                <w:rFonts w:ascii="Calibri" w:hAnsi="Calibri" w:cs="Calibri"/>
+                <w:color w:val="1F1A1A"/>
+                <w:sz w:val="19"/>
+                <w:szCs w:val="19"/>
+              </w:rPr>
+              <w:t>Publicar anuncios y eventos</w:t>
+            </w:r>
+          </w:p>
+        </w:tc>
+        <w:tc>
+          <w:tcPr>
+            <w:tcW w:w="0" w:type="auto"/>
+            <w:tcBorders>
+              <w:top w:val="single" w:sz="6" w:space="0" w:color="D9C9C5"/>
+              <w:left w:val="single" w:sz="6" w:space="0" w:color="D9C9C5"/>
+              <w:bottom w:val="single" w:sz="6" w:space="0" w:color="D9C9C5"/>
+              <w:right w:val="single" w:sz="6" w:space="0" w:color="D9C9C5"/>
+            </w:tcBorders>
+            <w:tcMar>
+              <w:top w:w="60" w:type="dxa"/>
+              <w:left w:w="100" w:type="dxa"/>
+              <w:bottom w:w="60" w:type="dxa"/>
+              <w:right w:w="100" w:type="dxa"/>
+            </w:tcMar>
+            <w:hideMark/>
+          </w:tcPr>
+          <w:p>
+            <w:pPr>
+              <w:pStyle w:val="celda"/>
+              <w:rPr>
+                <w:rFonts w:ascii="Calibri" w:hAnsi="Calibri" w:cs="Calibri"/>
+                <w:color w:val="1F1A1A"/>
+                <w:sz w:val="19"/>
+                <w:szCs w:val="19"/>
+              </w:rPr>
+            </w:pPr>
+            <w:r>
+              <w:rPr>
+                <w:rFonts w:ascii="Calibri" w:hAnsi="Calibri" w:cs="Calibri"/>
+                <w:color w:val="1F1A1A"/>
+                <w:sz w:val="19"/>
+                <w:szCs w:val="19"/>
+              </w:rPr>
+              <w:t>Hoy desde la consola (BASE_DE_DATOS §9.6)</w:t>
+            </w:r>
+          </w:p>
+        </w:tc>
+      </w:tr>
+      <w:tr>
+        <w:tc>
+          <w:tcPr>
+            <w:tcW w:w="0" w:type="auto"/>
+            <w:tcBorders>
+              <w:top w:val="single" w:sz="6" w:space="0" w:color="D9C9C5"/>
+              <w:left w:val="single" w:sz="6" w:space="0" w:color="D9C9C5"/>
+              <w:bottom w:val="single" w:sz="6" w:space="0" w:color="D9C9C5"/>
+              <w:right w:val="single" w:sz="6" w:space="0" w:color="D9C9C5"/>
+            </w:tcBorders>
+            <w:tcMar>
+              <w:top w:w="60" w:type="dxa"/>
+              <w:left w:w="100" w:type="dxa"/>
+              <w:bottom w:w="60" w:type="dxa"/>
+              <w:right w:w="100" w:type="dxa"/>
+            </w:tcMar>
+            <w:hideMark/>
+          </w:tcPr>
+          <w:p>
+            <w:pPr>
+              <w:pStyle w:val="celda"/>
+              <w:rPr>
+                <w:rFonts w:ascii="Calibri" w:hAnsi="Calibri" w:cs="Calibri"/>
+                <w:color w:val="1F1A1A"/>
+                <w:sz w:val="19"/>
+                <w:szCs w:val="19"/>
+              </w:rPr>
+            </w:pPr>
+            <w:r>
+              <w:rPr>
+                <w:rFonts w:ascii="Calibri" w:hAnsi="Calibri" w:cs="Calibri"/>
+                <w:color w:val="1F1A1A"/>
+                <w:sz w:val="19"/>
+                <w:szCs w:val="19"/>
+              </w:rPr>
+              <w:t>Ambos</w:t>
+            </w:r>
+          </w:p>
+        </w:tc>
+        <w:tc>
+          <w:tcPr>
+            <w:tcW w:w="0" w:type="auto"/>
+            <w:tcBorders>
+              <w:top w:val="single" w:sz="6" w:space="0" w:color="D9C9C5"/>
+              <w:left w:val="single" w:sz="6" w:space="0" w:color="D9C9C5"/>
+              <w:bottom w:val="single" w:sz="6" w:space="0" w:color="D9C9C5"/>
+              <w:right w:val="single" w:sz="6" w:space="0" w:color="D9C9C5"/>
+            </w:tcBorders>
+            <w:tcMar>
+              <w:top w:w="60" w:type="dxa"/>
+              <w:left w:w="100" w:type="dxa"/>
+              <w:bottom w:w="60" w:type="dxa"/>
+              <w:right w:w="100" w:type="dxa"/>
+            </w:tcMar>
+            <w:hideMark/>
+          </w:tcPr>
+          <w:p>
+            <w:pPr>
+              <w:pStyle w:val="celda"/>
+              <w:rPr>
+                <w:rFonts w:ascii="Calibri" w:hAnsi="Calibri" w:cs="Calibri"/>
+                <w:color w:val="1F1A1A"/>
+                <w:sz w:val="19"/>
+                <w:szCs w:val="19"/>
+              </w:rPr>
+            </w:pPr>
+            <w:r>
+              <w:rPr>
+                <w:rFonts w:ascii="Calibri" w:hAnsi="Calibri" w:cs="Calibri"/>
+                <w:color w:val="1F1A1A"/>
+                <w:sz w:val="19"/>
+                <w:szCs w:val="19"/>
+              </w:rPr>
+              <w:t>App Check</w:t>
+            </w:r>
+          </w:p>
+        </w:tc>
+        <w:tc>
+          <w:tcPr>
+            <w:tcW w:w="0" w:type="auto"/>
+            <w:tcBorders>
+              <w:top w:val="single" w:sz="6" w:space="0" w:color="D9C9C5"/>
+              <w:left w:val="single" w:sz="6" w:space="0" w:color="D9C9C5"/>
+              <w:bottom w:val="single" w:sz="6" w:space="0" w:color="D9C9C5"/>
+              <w:right w:val="single" w:sz="6" w:space="0" w:color="D9C9C5"/>
+            </w:tcBorders>
+            <w:tcMar>
+              <w:top w:w="60" w:type="dxa"/>
+              <w:left w:w="100" w:type="dxa"/>
+              <w:bottom w:w="60" w:type="dxa"/>
+              <w:right w:w="100" w:type="dxa"/>
+            </w:tcMar>
+            <w:hideMark/>
+          </w:tcPr>
+          <w:p>
+            <w:pPr>
+              <w:pStyle w:val="celda"/>
+              <w:rPr>
+                <w:rFonts w:ascii="Calibri" w:hAnsi="Calibri" w:cs="Calibri"/>
+                <w:color w:val="1F1A1A"/>
+                <w:sz w:val="19"/>
+                <w:szCs w:val="19"/>
+              </w:rPr>
+            </w:pPr>
+            <w:r>
+              <w:rPr>
+                <w:rFonts w:ascii="Calibri" w:hAnsi="Calibri" w:cs="Calibri"/>
+                <w:color w:val="1F1A1A"/>
+                <w:sz w:val="19"/>
+                <w:szCs w:val="19"/>
+              </w:rPr>
+              <w:t>ARQUITECTURA.md B3</w:t>
+            </w:r>
+          </w:p>
+        </w:tc>
+      </w:tr>
+    </w:tbl>
+    <w:p>
+      <w:pPr>
+        <w:pStyle w:val="NormalWeb"/>
+        <w:rPr>
+          <w:rFonts w:ascii="Calibri" w:hAnsi="Calibri" w:cs="Calibri"/>
+          <w:color w:val="1F1A1A"/>
+          <w:sz w:val="22"/>
+          <w:szCs w:val="22"/>
+        </w:rPr>
+      </w:pPr>
+      <w:r>
+        <w:rPr>
+          <w:rFonts w:ascii="Calibri" w:hAnsi="Calibri" w:cs="Calibri"/>
+          <w:color w:val="1F1A1A"/>
+          <w:sz w:val="22"/>
+          <w:szCs w:val="22"/>
+        </w:rPr>
+        <w:t xml:space="preserve">Estas pantallas siguen pendientes y, además, </w:t>
       </w:r>
       <w:r>
         <w:rPr>
@@ -8555,9 +10134,9 @@
         <w:tblLook w:val="04A0" w:firstRow="1" w:lastRow="0" w:firstColumn="1" w:lastColumn="0" w:noHBand="0" w:noVBand="1"/>
       </w:tblPr>
       <w:tblGrid>
-        <w:gridCol w:w="1755"/>
-        <w:gridCol w:w="2748"/>
-        <w:gridCol w:w="5161"/>
+        <w:gridCol w:w="1292"/>
+        <w:gridCol w:w="1879"/>
+        <w:gridCol w:w="6493"/>
       </w:tblGrid>
       <w:tr>
         <w:tc>
@@ -8801,7 +10380,27 @@
                 <w:sz w:val="19"/>
                 <w:szCs w:val="19"/>
               </w:rPr>
-              <w:t>Consultar y modificar cualquier estatus</w:t>
+              <w:t>Consultar y modificar cualquier estatus (</w:t>
+            </w:r>
+            <w:r>
+              <w:rPr>
+                <w:rFonts w:ascii="Calibri" w:hAnsi="Calibri" w:cs="Calibri"/>
+                <w:b/>
+                <w:bCs/>
+                <w:color w:val="1F1A1A"/>
+                <w:sz w:val="19"/>
+                <w:szCs w:val="19"/>
+              </w:rPr>
+              <w:t>consultar y agregar ya está</w:t>
+            </w:r>
+            <w:r>
+              <w:rPr>
+                <w:rFonts w:ascii="Calibri" w:hAnsi="Calibri" w:cs="Calibri"/>
+                <w:color w:val="1F1A1A"/>
+                <w:sz w:val="19"/>
+                <w:szCs w:val="19"/>
+              </w:rPr>
+              <w:t xml:space="preserve"> en el perfil; falta modificar y borrar)</w:t>
             </w:r>
           </w:p>
         </w:tc>
@@ -9227,45 +10826,45 @@
                 <w:sz w:val="19"/>
                 <w:szCs w:val="19"/>
               </w:rPr>
-              <w:t>Entradas y salidas</w:t>
-            </w:r>
-          </w:p>
-        </w:tc>
-        <w:tc>
-          <w:tcPr>
-            <w:tcW w:w="0" w:type="auto"/>
-            <w:tcBorders>
-              <w:top w:val="single" w:sz="6" w:space="0" w:color="D9C9C5"/>
-              <w:left w:val="single" w:sz="6" w:space="0" w:color="D9C9C5"/>
-              <w:bottom w:val="single" w:sz="6" w:space="0" w:color="D9C9C5"/>
-              <w:right w:val="single" w:sz="6" w:space="0" w:color="D9C9C5"/>
-            </w:tcBorders>
-            <w:tcMar>
-              <w:top w:w="60" w:type="dxa"/>
-              <w:left w:w="100" w:type="dxa"/>
-              <w:bottom w:w="60" w:type="dxa"/>
-              <w:right w:w="100" w:type="dxa"/>
-            </w:tcMar>
-            <w:hideMark/>
-          </w:tcPr>
-          <w:p>
-            <w:pPr>
-              <w:pStyle w:val="celda"/>
-              <w:rPr>
-                <w:rFonts w:ascii="Calibri" w:hAnsi="Calibri" w:cs="Calibri"/>
-                <w:color w:val="1F1A1A"/>
-                <w:sz w:val="19"/>
-                <w:szCs w:val="19"/>
-              </w:rPr>
-            </w:pPr>
-            <w:r>
-              <w:rPr>
-                <w:rFonts w:ascii="Calibri" w:hAnsi="Calibri" w:cs="Calibri"/>
-                <w:color w:val="1F1A1A"/>
-                <w:sz w:val="19"/>
-                <w:szCs w:val="19"/>
-              </w:rPr>
-              <w:t>Revisar quién ya entró o salió</w:t>
+              <w:t>~~Entradas y salidas~~</w:t>
+            </w:r>
+          </w:p>
+        </w:tc>
+        <w:tc>
+          <w:tcPr>
+            <w:tcW w:w="0" w:type="auto"/>
+            <w:tcBorders>
+              <w:top w:val="single" w:sz="6" w:space="0" w:color="D9C9C5"/>
+              <w:left w:val="single" w:sz="6" w:space="0" w:color="D9C9C5"/>
+              <w:bottom w:val="single" w:sz="6" w:space="0" w:color="D9C9C5"/>
+              <w:right w:val="single" w:sz="6" w:space="0" w:color="D9C9C5"/>
+            </w:tcBorders>
+            <w:tcMar>
+              <w:top w:w="60" w:type="dxa"/>
+              <w:left w:w="100" w:type="dxa"/>
+              <w:bottom w:w="60" w:type="dxa"/>
+              <w:right w:w="100" w:type="dxa"/>
+            </w:tcMar>
+            <w:hideMark/>
+          </w:tcPr>
+          <w:p>
+            <w:pPr>
+              <w:pStyle w:val="celda"/>
+              <w:rPr>
+                <w:rFonts w:ascii="Calibri" w:hAnsi="Calibri" w:cs="Calibri"/>
+                <w:color w:val="1F1A1A"/>
+                <w:sz w:val="19"/>
+                <w:szCs w:val="19"/>
+              </w:rPr>
+            </w:pPr>
+            <w:r>
+              <w:rPr>
+                <w:rFonts w:ascii="Calibri" w:hAnsi="Calibri" w:cs="Calibri"/>
+                <w:color w:val="1F1A1A"/>
+                <w:sz w:val="19"/>
+                <w:szCs w:val="19"/>
+              </w:rPr>
+              <w:t>Hecho (ADR-011)</w:t>
             </w:r>
           </w:p>
         </w:tc>
@@ -9343,45 +10942,45 @@
                 <w:sz w:val="19"/>
                 <w:szCs w:val="19"/>
               </w:rPr>
-              <w:t>Perfil del alumno</w:t>
-            </w:r>
-          </w:p>
-        </w:tc>
-        <w:tc>
-          <w:tcPr>
-            <w:tcW w:w="0" w:type="auto"/>
-            <w:tcBorders>
-              <w:top w:val="single" w:sz="6" w:space="0" w:color="D9C9C5"/>
-              <w:left w:val="single" w:sz="6" w:space="0" w:color="D9C9C5"/>
-              <w:bottom w:val="single" w:sz="6" w:space="0" w:color="D9C9C5"/>
-              <w:right w:val="single" w:sz="6" w:space="0" w:color="D9C9C5"/>
-            </w:tcBorders>
-            <w:tcMar>
-              <w:top w:w="60" w:type="dxa"/>
-              <w:left w:w="100" w:type="dxa"/>
-              <w:bottom w:w="60" w:type="dxa"/>
-              <w:right w:w="100" w:type="dxa"/>
-            </w:tcMar>
-            <w:hideMark/>
-          </w:tcPr>
-          <w:p>
-            <w:pPr>
-              <w:pStyle w:val="celda"/>
-              <w:rPr>
-                <w:rFonts w:ascii="Calibri" w:hAnsi="Calibri" w:cs="Calibri"/>
-                <w:color w:val="1F1A1A"/>
-                <w:sz w:val="19"/>
-                <w:szCs w:val="19"/>
-              </w:rPr>
-            </w:pPr>
-            <w:r>
-              <w:rPr>
-                <w:rFonts w:ascii="Calibri" w:hAnsi="Calibri" w:cs="Calibri"/>
-                <w:color w:val="1F1A1A"/>
-                <w:sz w:val="19"/>
-                <w:szCs w:val="19"/>
-              </w:rPr>
-              <w:t>Datos y estatus del alumno</w:t>
+              <w:t>~~Perfil del alumno~~</w:t>
+            </w:r>
+          </w:p>
+        </w:tc>
+        <w:tc>
+          <w:tcPr>
+            <w:tcW w:w="0" w:type="auto"/>
+            <w:tcBorders>
+              <w:top w:val="single" w:sz="6" w:space="0" w:color="D9C9C5"/>
+              <w:left w:val="single" w:sz="6" w:space="0" w:color="D9C9C5"/>
+              <w:bottom w:val="single" w:sz="6" w:space="0" w:color="D9C9C5"/>
+              <w:right w:val="single" w:sz="6" w:space="0" w:color="D9C9C5"/>
+            </w:tcBorders>
+            <w:tcMar>
+              <w:top w:w="60" w:type="dxa"/>
+              <w:left w:w="100" w:type="dxa"/>
+              <w:bottom w:w="60" w:type="dxa"/>
+              <w:right w:w="100" w:type="dxa"/>
+            </w:tcMar>
+            <w:hideMark/>
+          </w:tcPr>
+          <w:p>
+            <w:pPr>
+              <w:pStyle w:val="celda"/>
+              <w:rPr>
+                <w:rFonts w:ascii="Calibri" w:hAnsi="Calibri" w:cs="Calibri"/>
+                <w:color w:val="1F1A1A"/>
+                <w:sz w:val="19"/>
+                <w:szCs w:val="19"/>
+              </w:rPr>
+            </w:pPr>
+            <w:r>
+              <w:rPr>
+                <w:rFonts w:ascii="Calibri" w:hAnsi="Calibri" w:cs="Calibri"/>
+                <w:color w:val="1F1A1A"/>
+                <w:sz w:val="19"/>
+                <w:szCs w:val="19"/>
+              </w:rPr>
+              <w:t>Hecho (ADR-011)</w:t>
             </w:r>
           </w:p>
         </w:tc>
@@ -9423,7 +11022,7 @@
           <w:sz w:val="22"/>
           <w:szCs w:val="22"/>
         </w:rPr>
-        <w:pict w14:anchorId="3F51D574">
+        <w:pict w14:anchorId="26E8FAFB">
           <v:rect id="_x0000_i1033" style="width:0;height:1.5pt" o:hralign="center" o:hrstd="t" o:hr="t" fillcolor="#a0a0a0" stroked="f"/>
         </w:pict>
       </w:r>
@@ -9973,7 +11572,7 @@
           <w:sz w:val="22"/>
           <w:szCs w:val="22"/>
         </w:rPr>
-        <w:pict w14:anchorId="41768E25">
+        <w:pict w14:anchorId="52F12DD3">
           <v:rect id="_x0000_i1034" style="width:0;height:1.5pt" o:hralign="center" o:hrstd="t" o:hr="t" fillcolor="#a0a0a0" stroked="f"/>
         </w:pict>
       </w:r>
@@ -10004,9 +11603,9 @@
         <w:tblLook w:val="04A0" w:firstRow="1" w:lastRow="0" w:firstColumn="1" w:lastColumn="0" w:noHBand="0" w:noVBand="1"/>
       </w:tblPr>
       <w:tblGrid>
-        <w:gridCol w:w="1659"/>
-        <w:gridCol w:w="6533"/>
-        <w:gridCol w:w="1472"/>
+        <w:gridCol w:w="1489"/>
+        <w:gridCol w:w="6835"/>
+        <w:gridCol w:w="1340"/>
       </w:tblGrid>
       <w:tr>
         <w:tc>
@@ -10620,45 +12219,221 @@
                 <w:sz w:val="19"/>
                 <w:szCs w:val="19"/>
               </w:rPr>
-              <w:t>: escanear el QR del alumno de prueba (en otro teléfono), probar Entrada y Salida, teclear el No. de control y provocar cada alerta cambiando campos en la consola</w:t>
-            </w:r>
-          </w:p>
-        </w:tc>
-        <w:tc>
-          <w:tcPr>
-            <w:tcW w:w="0" w:type="auto"/>
-            <w:tcBorders>
-              <w:top w:val="single" w:sz="6" w:space="0" w:color="D9C9C5"/>
-              <w:left w:val="single" w:sz="6" w:space="0" w:color="D9C9C5"/>
-              <w:bottom w:val="single" w:sz="6" w:space="0" w:color="D9C9C5"/>
-              <w:right w:val="single" w:sz="6" w:space="0" w:color="D9C9C5"/>
-            </w:tcBorders>
-            <w:tcMar>
-              <w:top w:w="60" w:type="dxa"/>
-              <w:left w:w="100" w:type="dxa"/>
-              <w:bottom w:w="60" w:type="dxa"/>
-              <w:right w:w="100" w:type="dxa"/>
-            </w:tcMar>
-            <w:hideMark/>
-          </w:tcPr>
-          <w:p>
-            <w:pPr>
-              <w:pStyle w:val="celda"/>
-              <w:rPr>
-                <w:rFonts w:ascii="Calibri" w:hAnsi="Calibri" w:cs="Calibri"/>
-                <w:color w:val="1F1A1A"/>
-                <w:sz w:val="19"/>
-                <w:szCs w:val="19"/>
-              </w:rPr>
-            </w:pPr>
-            <w:r>
-              <w:rPr>
-                <w:rFonts w:ascii="Calibri" w:hAnsi="Calibri" w:cs="Calibri"/>
-                <w:color w:val="1F1A1A"/>
-                <w:sz w:val="19"/>
-                <w:szCs w:val="19"/>
-              </w:rPr>
-              <w:t>ADR-009 (acción 7)</w:t>
+              <w:t>: escanear el QR del alumno de prueba (en otro teléfono), probar Entrada y Salida, teclear el No. de control y provocar cada alerta cambiando campos en la consola. Revisar que el resultado diga el motivo y que la alerta salga en "Alertas de hoy"</w:t>
+            </w:r>
+          </w:p>
+        </w:tc>
+        <w:tc>
+          <w:tcPr>
+            <w:tcW w:w="0" w:type="auto"/>
+            <w:tcBorders>
+              <w:top w:val="single" w:sz="6" w:space="0" w:color="D9C9C5"/>
+              <w:left w:val="single" w:sz="6" w:space="0" w:color="D9C9C5"/>
+              <w:bottom w:val="single" w:sz="6" w:space="0" w:color="D9C9C5"/>
+              <w:right w:val="single" w:sz="6" w:space="0" w:color="D9C9C5"/>
+            </w:tcBorders>
+            <w:tcMar>
+              <w:top w:w="60" w:type="dxa"/>
+              <w:left w:w="100" w:type="dxa"/>
+              <w:bottom w:w="60" w:type="dxa"/>
+              <w:right w:w="100" w:type="dxa"/>
+            </w:tcMar>
+            <w:hideMark/>
+          </w:tcPr>
+          <w:p>
+            <w:pPr>
+              <w:pStyle w:val="celda"/>
+              <w:rPr>
+                <w:rFonts w:ascii="Calibri" w:hAnsi="Calibri" w:cs="Calibri"/>
+                <w:color w:val="1F1A1A"/>
+                <w:sz w:val="19"/>
+                <w:szCs w:val="19"/>
+              </w:rPr>
+            </w:pPr>
+            <w:r>
+              <w:rPr>
+                <w:rFonts w:ascii="Calibri" w:hAnsi="Calibri" w:cs="Calibri"/>
+                <w:color w:val="1F1A1A"/>
+                <w:sz w:val="19"/>
+                <w:szCs w:val="19"/>
+              </w:rPr>
+              <w:t>ADR-009 (acción 7), ADR-010</w:t>
+            </w:r>
+          </w:p>
+        </w:tc>
+      </w:tr>
+      <w:tr>
+        <w:tc>
+          <w:tcPr>
+            <w:tcW w:w="0" w:type="auto"/>
+            <w:tcBorders>
+              <w:top w:val="single" w:sz="6" w:space="0" w:color="D9C9C5"/>
+              <w:left w:val="single" w:sz="6" w:space="0" w:color="D9C9C5"/>
+              <w:bottom w:val="single" w:sz="6" w:space="0" w:color="D9C9C5"/>
+              <w:right w:val="single" w:sz="6" w:space="0" w:color="D9C9C5"/>
+            </w:tcBorders>
+            <w:tcMar>
+              <w:top w:w="60" w:type="dxa"/>
+              <w:left w:w="100" w:type="dxa"/>
+              <w:bottom w:w="60" w:type="dxa"/>
+              <w:right w:w="100" w:type="dxa"/>
+            </w:tcMar>
+            <w:hideMark/>
+          </w:tcPr>
+          <w:p>
+            <w:pPr>
+              <w:pStyle w:val="celda"/>
+              <w:rPr>
+                <w:rFonts w:ascii="Calibri" w:hAnsi="Calibri" w:cs="Calibri"/>
+                <w:color w:val="1F1A1A"/>
+                <w:sz w:val="19"/>
+                <w:szCs w:val="19"/>
+              </w:rPr>
+            </w:pPr>
+            <w:r>
+              <w:rPr>
+                <w:rFonts w:ascii="Calibri" w:hAnsi="Calibri" w:cs="Calibri"/>
+                <w:color w:val="1F1A1A"/>
+                <w:sz w:val="19"/>
+                <w:szCs w:val="19"/>
+              </w:rPr>
+              <w:t>Avisos</w:t>
+            </w:r>
+          </w:p>
+        </w:tc>
+        <w:tc>
+          <w:tcPr>
+            <w:tcW w:w="0" w:type="auto"/>
+            <w:tcBorders>
+              <w:top w:val="single" w:sz="6" w:space="0" w:color="D9C9C5"/>
+              <w:left w:val="single" w:sz="6" w:space="0" w:color="D9C9C5"/>
+              <w:bottom w:val="single" w:sz="6" w:space="0" w:color="D9C9C5"/>
+              <w:right w:val="single" w:sz="6" w:space="0" w:color="D9C9C5"/>
+            </w:tcBorders>
+            <w:tcMar>
+              <w:top w:w="60" w:type="dxa"/>
+              <w:left w:w="100" w:type="dxa"/>
+              <w:bottom w:w="60" w:type="dxa"/>
+              <w:right w:w="100" w:type="dxa"/>
+            </w:tcMar>
+            <w:hideMark/>
+          </w:tcPr>
+          <w:p>
+            <w:pPr>
+              <w:pStyle w:val="celda"/>
+              <w:rPr>
+                <w:rFonts w:ascii="Calibri" w:hAnsi="Calibri" w:cs="Calibri"/>
+                <w:color w:val="1F1A1A"/>
+                <w:sz w:val="19"/>
+                <w:szCs w:val="19"/>
+              </w:rPr>
+            </w:pPr>
+            <w:r>
+              <w:rPr>
+                <w:rFonts w:ascii="Calibri" w:hAnsi="Calibri" w:cs="Calibri"/>
+                <w:color w:val="1F1A1A"/>
+                <w:sz w:val="19"/>
+                <w:szCs w:val="19"/>
+              </w:rPr>
+              <w:t xml:space="preserve">Con </w:t>
+            </w:r>
+            <w:r>
+              <w:rPr>
+                <w:rStyle w:val="HTMLCode"/>
+              </w:rPr>
+              <w:t>padre.prueba</w:t>
+            </w:r>
+            <w:r>
+              <w:rPr>
+                <w:rFonts w:ascii="Calibri" w:hAnsi="Calibri" w:cs="Calibri"/>
+                <w:color w:val="1F1A1A"/>
+                <w:sz w:val="19"/>
+                <w:szCs w:val="19"/>
+              </w:rPr>
+              <w:t xml:space="preserve"> </w:t>
+            </w:r>
+            <w:r>
+              <w:rPr>
+                <w:rFonts w:ascii="Calibri" w:hAnsi="Calibri" w:cs="Calibri"/>
+                <w:color w:val="1F1A1A"/>
+                <w:sz w:val="19"/>
+                <w:szCs w:val="19"/>
+              </w:rPr>
+              <w:t xml:space="preserve">abierto: el prefecto registra una entrada y el profesor pone una falta; el aviso debe aparecer solo, la campana encenderse y el menú </w:t>
+            </w:r>
+            <w:r>
+              <w:rPr>
+                <w:rFonts w:ascii="Segoe UI Symbol" w:hAnsi="Segoe UI Symbol" w:cs="Segoe UI Symbol"/>
+                <w:color w:val="1F1A1A"/>
+                <w:sz w:val="19"/>
+                <w:szCs w:val="19"/>
+              </w:rPr>
+              <w:t>☰</w:t>
+            </w:r>
+            <w:r>
+              <w:rPr>
+                <w:rFonts w:ascii="Calibri" w:hAnsi="Calibri" w:cs="Calibri"/>
+                <w:color w:val="1F1A1A"/>
+                <w:sz w:val="19"/>
+                <w:szCs w:val="19"/>
+              </w:rPr>
+              <w:t xml:space="preserve"> decir "2". "Marcar todas como le</w:t>
+            </w:r>
+            <w:r>
+              <w:rPr>
+                <w:rFonts w:ascii="Calibri" w:hAnsi="Calibri" w:cs="Calibri"/>
+                <w:color w:val="1F1A1A"/>
+                <w:sz w:val="19"/>
+                <w:szCs w:val="19"/>
+              </w:rPr>
+              <w:t>í</w:t>
+            </w:r>
+            <w:r>
+              <w:rPr>
+                <w:rFonts w:ascii="Calibri" w:hAnsi="Calibri" w:cs="Calibri"/>
+                <w:color w:val="1F1A1A"/>
+                <w:sz w:val="19"/>
+                <w:szCs w:val="19"/>
+              </w:rPr>
+              <w:t>das" apaga la campana</w:t>
+            </w:r>
+          </w:p>
+        </w:tc>
+        <w:tc>
+          <w:tcPr>
+            <w:tcW w:w="0" w:type="auto"/>
+            <w:tcBorders>
+              <w:top w:val="single" w:sz="6" w:space="0" w:color="D9C9C5"/>
+              <w:left w:val="single" w:sz="6" w:space="0" w:color="D9C9C5"/>
+              <w:bottom w:val="single" w:sz="6" w:space="0" w:color="D9C9C5"/>
+              <w:right w:val="single" w:sz="6" w:space="0" w:color="D9C9C5"/>
+            </w:tcBorders>
+            <w:tcMar>
+              <w:top w:w="60" w:type="dxa"/>
+              <w:left w:w="100" w:type="dxa"/>
+              <w:bottom w:w="60" w:type="dxa"/>
+              <w:right w:w="100" w:type="dxa"/>
+            </w:tcMar>
+            <w:hideMark/>
+          </w:tcPr>
+          <w:p>
+            <w:pPr>
+              <w:pStyle w:val="celda"/>
+              <w:rPr>
+                <w:rFonts w:ascii="Calibri" w:hAnsi="Calibri" w:cs="Calibri"/>
+                <w:color w:val="1F1A1A"/>
+                <w:sz w:val="19"/>
+                <w:szCs w:val="19"/>
+              </w:rPr>
+            </w:pPr>
+            <w:r>
+              <w:rPr>
+                <w:rFonts w:ascii="Calibri" w:hAnsi="Calibri" w:cs="Calibri"/>
+                <w:color w:val="1F1A1A"/>
+                <w:sz w:val="19"/>
+                <w:szCs w:val="19"/>
+              </w:rPr>
+              <w:t>ADR-010 (acción 7)</w:t>
             </w:r>
           </w:p>
         </w:tc>
@@ -10970,7 +12745,7 @@
           <w:sz w:val="22"/>
           <w:szCs w:val="22"/>
         </w:rPr>
-        <w:pict w14:anchorId="7C37F475">
+        <w:pict w14:anchorId="0977CBCD">
           <v:rect id="_x0000_i1035" style="width:0;height:1.5pt" o:hralign="center" o:hrstd="t" o:hr="t" fillcolor="#a0a0a0" stroked="f"/>
         </w:pict>
       </w:r>
@@ -11046,16 +12821,7 @@
           <w:sz w:val="22"/>
           <w:szCs w:val="22"/>
         </w:rPr>
-        <w:t>n;</w:t>
-      </w:r>
-      <w:r>
-        <w:rPr>
-          <w:rFonts w:ascii="Calibri" w:eastAsia="Times New Roman" w:hAnsi="Calibri" w:cs="Calibri"/>
-          <w:color w:val="1F1A1A"/>
-          <w:sz w:val="22"/>
-          <w:szCs w:val="22"/>
-        </w:rPr>
-        <w:t xml:space="preserve"> </w:t>
+        <w:t xml:space="preserve">n; </w:t>
       </w:r>
       <w:r>
         <w:rPr>
@@ -11136,7 +12902,7 @@
           <w:sz w:val="22"/>
           <w:szCs w:val="22"/>
         </w:rPr>
-        <w:pict w14:anchorId="09AA369A">
+        <w:pict w14:anchorId="53D22A46">
           <v:rect id="_x0000_i1036" style="width:0;height:1.5pt" o:hralign="center" o:hrstd="t" o:hr="t" fillcolor="#a0a0a0" stroked="f"/>
         </w:pict>
       </w:r>
@@ -11153,6 +12919,87 @@
           <w:rFonts w:ascii="Calibri" w:eastAsia="Times New Roman" w:hAnsi="Calibri" w:cs="Calibri"/>
         </w:rPr>
         <w:t>12. Estructura del código (propuesta, ADR-008)</w:t>
+      </w:r>
+    </w:p>
+    <w:p>
+      <w:pPr>
+        <w:shd w:val="clear" w:color="auto" w:fill="F7F5F4"/>
+        <w:divId w:val="1171602870"/>
+        <w:rPr>
+          <w:rFonts w:ascii="Calibri" w:eastAsia="Times New Roman" w:hAnsi="Calibri" w:cs="Calibri"/>
+          <w:color w:val="1F1A1A"/>
+          <w:sz w:val="22"/>
+          <w:szCs w:val="22"/>
+        </w:rPr>
+      </w:pPr>
+      <w:r>
+        <w:rPr>
+          <w:rFonts w:ascii="Calibri" w:eastAsia="Times New Roman" w:hAnsi="Calibri" w:cs="Calibri"/>
+          <w:b/>
+          <w:bCs/>
+          <w:color w:val="1F1A1A"/>
+          <w:sz w:val="22"/>
+          <w:szCs w:val="22"/>
+        </w:rPr>
+        <w:t>20 de octubre:</w:t>
+      </w:r>
+      <w:r>
+        <w:rPr>
+          <w:rFonts w:ascii="Calibri" w:eastAsia="Times New Roman" w:hAnsi="Calibri" w:cs="Calibri"/>
+          <w:color w:val="1F1A1A"/>
+          <w:sz w:val="22"/>
+          <w:szCs w:val="22"/>
+        </w:rPr>
+        <w:t xml:space="preserve"> </w:t>
+      </w:r>
+      <w:r>
+        <w:rPr>
+          <w:rFonts w:ascii="Calibri" w:eastAsia="Times New Roman" w:hAnsi="Calibri" w:cs="Calibri"/>
+          <w:color w:val="1F1A1A"/>
+          <w:sz w:val="22"/>
+          <w:szCs w:val="22"/>
+        </w:rPr>
+        <w:t xml:space="preserve">la revisión de </w:t>
+      </w:r>
+      <w:r>
+        <w:rPr>
+          <w:rFonts w:ascii="Calibri" w:eastAsia="Times New Roman" w:hAnsi="Calibri" w:cs="Calibri"/>
+          <w:b/>
+          <w:bCs/>
+          <w:color w:val="1F1A1A"/>
+          <w:sz w:val="22"/>
+          <w:szCs w:val="22"/>
+        </w:rPr>
+        <w:t>todo el sistema</w:t>
+      </w:r>
+      <w:r>
+        <w:rPr>
+          <w:rFonts w:ascii="Calibri" w:eastAsia="Times New Roman" w:hAnsi="Calibri" w:cs="Calibri"/>
+          <w:color w:val="1F1A1A"/>
+          <w:sz w:val="22"/>
+          <w:szCs w:val="22"/>
+        </w:rPr>
+        <w:t xml:space="preserve"> está en </w:t>
+      </w:r>
+      <w:hyperlink r:id="rId7" w:history="1">
+        <w:r>
+          <w:rPr>
+            <w:rStyle w:val="Hyperlink"/>
+            <w:rFonts w:ascii="Calibri" w:eastAsia="Times New Roman" w:hAnsi="Calibri" w:cs="Calibri"/>
+            <w:sz w:val="22"/>
+            <w:szCs w:val="22"/>
+          </w:rPr>
+          <w:t>ARQUITECTURA.md</w:t>
+        </w:r>
+      </w:hyperlink>
+      <w:r>
+        <w:rPr>
+          <w:rFonts w:ascii="Calibri" w:eastAsia="Times New Roman" w:hAnsi="Calibri" w:cs="Calibri"/>
+          <w:color w:val="1F1A1A"/>
+          <w:sz w:val="22"/>
+          <w:szCs w:val="22"/>
+        </w:rPr>
+        <w:t>, con más puntos (escaneo sin señal, hora del servidor, proyecto de pruebas, App Check, custom claims, respaldos, script de administración, GitHub Actions). Su §4 trae el orden que se propone. Esta tabla sigue siendo la del código de la app.</w:t>
       </w:r>
     </w:p>
     <w:p>
@@ -12799,9 +14646,9 @@
 <file path=word/numbering.xml><?xml version="1.0" encoding="utf-8"?>
 <w:numbering xmlns:wpc="http://schemas.microsoft.com/office/word/2010/wordprocessingCanvas" xmlns:cx="http://schemas.microsoft.com/office/drawing/2014/chartex" xmlns:cx1="http://schemas.microsoft.com/office/drawing/2015/9/8/chartex" xmlns:cx2="http://schemas.microsoft.com/office/drawing/2015/10/21/chartex" xmlns:cx3="http://schemas.microsoft.com/office/drawing/2016/5/9/chartex" xmlns:cx4="http://schemas.microsoft.com/office/drawing/2016/5/10/chartex" xmlns:cx5="http://schemas.microsoft.com/office/drawing/2016/5/11/chartex" xmlns:cx6="http://schemas.microsoft.com/office/drawing/2016/5/12/chartex" xmlns:cx7="http://schemas.microsoft.com/office/drawing/2016/5/13/chartex" xmlns:cx8="http://schemas.microsoft.com/office/drawing/2016/5/14/chartex" xmlns:mc="http://schemas.openxmlformats.org/markup-compatibility/2006" xmlns:aink="http://schemas.microsoft.com/office/drawing/2016/ink" xmlns:am3d="http://schemas.microsoft.com/office/drawing/2017/model3d" xmlns:o="urn:schemas-microsoft-com:office:office" xmlns:oel="http://schemas.microsoft.com/office/2019/extlst" xmlns:r="http://schemas.openxmlformats.org/officeDocument/2006/relationships" xmlns:m="http://schemas.openxmlformats.org/officeDocument/2006/math" xmlns:v="urn:schemas-microsoft-com:vml" xmlns:wp14="http://schemas.microsoft.com/office/word/2010/wordprocessingDrawing" xmlns:wp="http://schemas.openxmlformats.org/drawingml/2006/wordprocessingDrawing" xmlns:w10="urn:schemas-microsoft-com:office:word" xmlns:w="http://schemas.openxmlformats.org/wordprocessingml/2006/main" xmlns:w14="http://schemas.microsoft.com/office/word/2010/wordml" xmlns:w15="http://schemas.microsoft.com/office/word/2012/wordml" xmlns:w16cex="http://schemas.microsoft.com/office/word/2018/wordml/cex" xmlns:w16cid="http://schemas.microsoft.com/office/word/2016/wordml/cid" xmlns:w16="http://schemas.microsoft.com/office/word/2018/wordml" xmlns:w16du="http://schemas.microsoft.com/office/word/2023/wordml/word16du" xmlns:w16sdtdh="http://schemas.microsoft.com/office/word/2020/wordml/sdtdatahash" xmlns:w16sdtfl="http://schemas.microsoft.com/office/word/2024/wordml/sdtformatlock" xmlns:w16se="http://schemas.microsoft.com/office/word/2015/wordml/symex" xmlns:wpg="http://schemas.microsoft.com/office/word/2010/wordprocessingGroup" xmlns:wpi="http://schemas.microsoft.com/office/word/2010/wordprocessingInk" xmlns:wne="http://schemas.microsoft.com/office/word/2006/wordml" xmlns:wps="http://schemas.microsoft.com/office/word/2010/wordprocessingShape" mc:Ignorable="w14 w15 w16se w16cid w16 w16cex w16sdtdh w16sdtfl w16du wp14">
   <w:abstractNum w:abstractNumId="0" w15:restartNumberingAfterBreak="0">
-    <w:nsid w:val="12882051"/>
+    <w:nsid w:val="33D824EC"/>
     <w:multiLevelType w:val="multilevel"/>
-    <w:tmpl w:val="0652FA7A"/>
+    <w:tmpl w:val="7AAA6B98"/>
     <w:lvl w:ilvl="0">
       <w:start w:val="1"/>
       <w:numFmt w:val="bullet"/>
@@ -12948,122 +14795,9 @@
     </w:lvl>
   </w:abstractNum>
   <w:abstractNum w:abstractNumId="1" w15:restartNumberingAfterBreak="0">
-    <w:nsid w:val="33EE68FA"/>
+    <w:nsid w:val="53AA6AB3"/>
     <w:multiLevelType w:val="multilevel"/>
-    <w:tmpl w:val="0E484FA8"/>
-    <w:lvl w:ilvl="0">
-      <w:start w:val="1"/>
-      <w:numFmt w:val="decimal"/>
-      <w:lvlText w:val="%1."/>
-      <w:lvlJc w:val="left"/>
-      <w:pPr>
-        <w:tabs>
-          <w:tab w:val="num" w:pos="720"/>
-        </w:tabs>
-        <w:ind w:left="720" w:hanging="360"/>
-      </w:pPr>
-    </w:lvl>
-    <w:lvl w:ilvl="1" w:tentative="1">
-      <w:start w:val="1"/>
-      <w:numFmt w:val="decimal"/>
-      <w:lvlText w:val="%2."/>
-      <w:lvlJc w:val="left"/>
-      <w:pPr>
-        <w:tabs>
-          <w:tab w:val="num" w:pos="1440"/>
-        </w:tabs>
-        <w:ind w:left="1440" w:hanging="360"/>
-      </w:pPr>
-    </w:lvl>
-    <w:lvl w:ilvl="2" w:tentative="1">
-      <w:start w:val="1"/>
-      <w:numFmt w:val="decimal"/>
-      <w:lvlText w:val="%3."/>
-      <w:lvlJc w:val="left"/>
-      <w:pPr>
-        <w:tabs>
-          <w:tab w:val="num" w:pos="2160"/>
-        </w:tabs>
-        <w:ind w:left="2160" w:hanging="360"/>
-      </w:pPr>
-    </w:lvl>
-    <w:lvl w:ilvl="3" w:tentative="1">
-      <w:start w:val="1"/>
-      <w:numFmt w:val="decimal"/>
-      <w:lvlText w:val="%4."/>
-      <w:lvlJc w:val="left"/>
-      <w:pPr>
-        <w:tabs>
-          <w:tab w:val="num" w:pos="2880"/>
-        </w:tabs>
-        <w:ind w:left="2880" w:hanging="360"/>
-      </w:pPr>
-    </w:lvl>
-    <w:lvl w:ilvl="4" w:tentative="1">
-      <w:start w:val="1"/>
-      <w:numFmt w:val="decimal"/>
-      <w:lvlText w:val="%5."/>
-      <w:lvlJc w:val="left"/>
-      <w:pPr>
-        <w:tabs>
-          <w:tab w:val="num" w:pos="3600"/>
-        </w:tabs>
-        <w:ind w:left="3600" w:hanging="360"/>
-      </w:pPr>
-    </w:lvl>
-    <w:lvl w:ilvl="5" w:tentative="1">
-      <w:start w:val="1"/>
-      <w:numFmt w:val="decimal"/>
-      <w:lvlText w:val="%6."/>
-      <w:lvlJc w:val="left"/>
-      <w:pPr>
-        <w:tabs>
-          <w:tab w:val="num" w:pos="4320"/>
-        </w:tabs>
-        <w:ind w:left="4320" w:hanging="360"/>
-      </w:pPr>
-    </w:lvl>
-    <w:lvl w:ilvl="6" w:tentative="1">
-      <w:start w:val="1"/>
-      <w:numFmt w:val="decimal"/>
-      <w:lvlText w:val="%7."/>
-      <w:lvlJc w:val="left"/>
-      <w:pPr>
-        <w:tabs>
-          <w:tab w:val="num" w:pos="5040"/>
-        </w:tabs>
-        <w:ind w:left="5040" w:hanging="360"/>
-      </w:pPr>
-    </w:lvl>
-    <w:lvl w:ilvl="7" w:tentative="1">
-      <w:start w:val="1"/>
-      <w:numFmt w:val="decimal"/>
-      <w:lvlText w:val="%8."/>
-      <w:lvlJc w:val="left"/>
-      <w:pPr>
-        <w:tabs>
-          <w:tab w:val="num" w:pos="5760"/>
-        </w:tabs>
-        <w:ind w:left="5760" w:hanging="360"/>
-      </w:pPr>
-    </w:lvl>
-    <w:lvl w:ilvl="8" w:tentative="1">
-      <w:start w:val="1"/>
-      <w:numFmt w:val="decimal"/>
-      <w:lvlText w:val="%9."/>
-      <w:lvlJc w:val="left"/>
-      <w:pPr>
-        <w:tabs>
-          <w:tab w:val="num" w:pos="6480"/>
-        </w:tabs>
-        <w:ind w:left="6480" w:hanging="360"/>
-      </w:pPr>
-    </w:lvl>
-  </w:abstractNum>
-  <w:abstractNum w:abstractNumId="2" w15:restartNumberingAfterBreak="0">
-    <w:nsid w:val="4A876912"/>
-    <w:multiLevelType w:val="multilevel"/>
-    <w:tmpl w:val="6B680FB0"/>
+    <w:tmpl w:val="DB8ACEB6"/>
     <w:lvl w:ilvl="0">
       <w:start w:val="1"/>
       <w:numFmt w:val="bullet"/>
@@ -13209,14 +14943,127 @@
       </w:rPr>
     </w:lvl>
   </w:abstractNum>
-  <w:num w:numId="1" w16cid:durableId="1522743050">
-    <w:abstractNumId w:val="0"/>
-  </w:num>
-  <w:num w:numId="2" w16cid:durableId="756437273">
+  <w:abstractNum w:abstractNumId="2" w15:restartNumberingAfterBreak="0">
+    <w:nsid w:val="76254DEA"/>
+    <w:multiLevelType w:val="multilevel"/>
+    <w:tmpl w:val="7F520186"/>
+    <w:lvl w:ilvl="0">
+      <w:start w:val="1"/>
+      <w:numFmt w:val="decimal"/>
+      <w:lvlText w:val="%1."/>
+      <w:lvlJc w:val="left"/>
+      <w:pPr>
+        <w:tabs>
+          <w:tab w:val="num" w:pos="720"/>
+        </w:tabs>
+        <w:ind w:left="720" w:hanging="360"/>
+      </w:pPr>
+    </w:lvl>
+    <w:lvl w:ilvl="1" w:tentative="1">
+      <w:start w:val="1"/>
+      <w:numFmt w:val="decimal"/>
+      <w:lvlText w:val="%2."/>
+      <w:lvlJc w:val="left"/>
+      <w:pPr>
+        <w:tabs>
+          <w:tab w:val="num" w:pos="1440"/>
+        </w:tabs>
+        <w:ind w:left="1440" w:hanging="360"/>
+      </w:pPr>
+    </w:lvl>
+    <w:lvl w:ilvl="2" w:tentative="1">
+      <w:start w:val="1"/>
+      <w:numFmt w:val="decimal"/>
+      <w:lvlText w:val="%3."/>
+      <w:lvlJc w:val="left"/>
+      <w:pPr>
+        <w:tabs>
+          <w:tab w:val="num" w:pos="2160"/>
+        </w:tabs>
+        <w:ind w:left="2160" w:hanging="360"/>
+      </w:pPr>
+    </w:lvl>
+    <w:lvl w:ilvl="3" w:tentative="1">
+      <w:start w:val="1"/>
+      <w:numFmt w:val="decimal"/>
+      <w:lvlText w:val="%4."/>
+      <w:lvlJc w:val="left"/>
+      <w:pPr>
+        <w:tabs>
+          <w:tab w:val="num" w:pos="2880"/>
+        </w:tabs>
+        <w:ind w:left="2880" w:hanging="360"/>
+      </w:pPr>
+    </w:lvl>
+    <w:lvl w:ilvl="4" w:tentative="1">
+      <w:start w:val="1"/>
+      <w:numFmt w:val="decimal"/>
+      <w:lvlText w:val="%5."/>
+      <w:lvlJc w:val="left"/>
+      <w:pPr>
+        <w:tabs>
+          <w:tab w:val="num" w:pos="3600"/>
+        </w:tabs>
+        <w:ind w:left="3600" w:hanging="360"/>
+      </w:pPr>
+    </w:lvl>
+    <w:lvl w:ilvl="5" w:tentative="1">
+      <w:start w:val="1"/>
+      <w:numFmt w:val="decimal"/>
+      <w:lvlText w:val="%6."/>
+      <w:lvlJc w:val="left"/>
+      <w:pPr>
+        <w:tabs>
+          <w:tab w:val="num" w:pos="4320"/>
+        </w:tabs>
+        <w:ind w:left="4320" w:hanging="360"/>
+      </w:pPr>
+    </w:lvl>
+    <w:lvl w:ilvl="6" w:tentative="1">
+      <w:start w:val="1"/>
+      <w:numFmt w:val="decimal"/>
+      <w:lvlText w:val="%7."/>
+      <w:lvlJc w:val="left"/>
+      <w:pPr>
+        <w:tabs>
+          <w:tab w:val="num" w:pos="5040"/>
+        </w:tabs>
+        <w:ind w:left="5040" w:hanging="360"/>
+      </w:pPr>
+    </w:lvl>
+    <w:lvl w:ilvl="7" w:tentative="1">
+      <w:start w:val="1"/>
+      <w:numFmt w:val="decimal"/>
+      <w:lvlText w:val="%8."/>
+      <w:lvlJc w:val="left"/>
+      <w:pPr>
+        <w:tabs>
+          <w:tab w:val="num" w:pos="5760"/>
+        </w:tabs>
+        <w:ind w:left="5760" w:hanging="360"/>
+      </w:pPr>
+    </w:lvl>
+    <w:lvl w:ilvl="8" w:tentative="1">
+      <w:start w:val="1"/>
+      <w:numFmt w:val="decimal"/>
+      <w:lvlText w:val="%9."/>
+      <w:lvlJc w:val="left"/>
+      <w:pPr>
+        <w:tabs>
+          <w:tab w:val="num" w:pos="6480"/>
+        </w:tabs>
+        <w:ind w:left="6480" w:hanging="360"/>
+      </w:pPr>
+    </w:lvl>
+  </w:abstractNum>
+  <w:num w:numId="1" w16cid:durableId="1470323582">
     <w:abstractNumId w:val="1"/>
   </w:num>
-  <w:num w:numId="3" w16cid:durableId="651562993">
+  <w:num w:numId="2" w16cid:durableId="2022581529">
     <w:abstractNumId w:val="2"/>
+  </w:num>
+  <w:num w:numId="3" w16cid:durableId="144401849">
+    <w:abstractNumId w:val="0"/>
   </w:num>
 </w:numbering>
 </file>

</xml_diff>

<commit_message>
Web registrada en Firebase y servidor local sin Node.js
- App web "CetisAsiste web" registrada; apiKey y appId en web/js/config.js
  (la web usa la base real también en localhost; el emulador, con ?emulador).
- docs/herramientas/servidor_web.ps1: sirve web/ en http://localhost:5000
  con PowerShell 5.1, sin instalar nada.
- .claude/launch.json con la configuración "web".
- Bitácora 20-05, web/README.md, PENDIENTES, TRASPASO, ADR-011 y sus Word.

Co-Authored-By: Claude Opus 5.5 <noreply@anthropic.com>
</commit_message>
<xml_diff>
--- a/docs/PENDIENTES.docx
+++ b/docs/PENDIENTES.docx
@@ -321,7 +321,7 @@
           <w:sz w:val="22"/>
           <w:szCs w:val="22"/>
         </w:rPr>
-        <w:pict w14:anchorId="4CCD36A0">
+        <w:pict w14:anchorId="2EA6ED09">
           <v:rect id="_x0000_i1025" style="width:0;height:1.5pt" o:hralign="center" o:hrstd="t" o:hr="t" fillcolor="#a0a0a0" stroked="f"/>
         </w:pict>
       </w:r>
@@ -353,9 +353,9 @@
       </w:tblPr>
       <w:tblGrid>
         <w:gridCol w:w="297"/>
-        <w:gridCol w:w="4173"/>
-        <w:gridCol w:w="1113"/>
-        <w:gridCol w:w="4081"/>
+        <w:gridCol w:w="4911"/>
+        <w:gridCol w:w="1043"/>
+        <w:gridCol w:w="3413"/>
       </w:tblGrid>
       <w:tr>
         <w:tc>
@@ -1440,6 +1440,7 @@
                 <w:sz w:val="19"/>
                 <w:szCs w:val="19"/>
               </w:rPr>
+              <w:lastRenderedPageBreak/>
               <w:t>5</w:t>
             </w:r>
           </w:p>
@@ -1480,15 +1481,51 @@
                 <w:sz w:val="19"/>
                 <w:szCs w:val="19"/>
               </w:rPr>
-              <w:t xml:space="preserve">Registrar la web en Firebase, llenar </w:t>
-            </w:r>
-            <w:r>
-              <w:rPr>
-                <w:rStyle w:val="HTMLCode"/>
+              <w:t>Publicar la web</w:t>
+            </w:r>
+            <w:r>
+              <w:rPr>
+                <w:rFonts w:ascii="Calibri" w:hAnsi="Calibri" w:cs="Calibri"/>
+                <w:color w:val="1F1A1A"/>
+                <w:sz w:val="19"/>
+                <w:szCs w:val="19"/>
+              </w:rPr>
+              <w:t xml:space="preserve"> con Firebase Hosting (necesita Node.js). Ya está </w:t>
+            </w:r>
+            <w:r>
+              <w:rPr>
+                <w:rFonts w:ascii="Calibri" w:hAnsi="Calibri" w:cs="Calibri"/>
                 <w:b/>
                 <w:bCs/>
+                <w:color w:val="1F1A1A"/>
+                <w:sz w:val="19"/>
+                <w:szCs w:val="19"/>
+              </w:rPr>
+              <w:t>registrada</w:t>
+            </w:r>
+            <w:r>
+              <w:rPr>
+                <w:rFonts w:ascii="Calibri" w:hAnsi="Calibri" w:cs="Calibri"/>
+                <w:color w:val="1F1A1A"/>
+                <w:sz w:val="19"/>
+                <w:szCs w:val="19"/>
+              </w:rPr>
+              <w:t xml:space="preserve"> en Firebase y </w:t>
+            </w:r>
+            <w:r>
+              <w:rPr>
+                <w:rStyle w:val="HTMLCode"/>
               </w:rPr>
               <w:t>web/js/config.js</w:t>
+            </w:r>
+            <w:r>
+              <w:rPr>
+                <w:rFonts w:ascii="Calibri" w:hAnsi="Calibri" w:cs="Calibri"/>
+                <w:color w:val="1F1A1A"/>
+                <w:sz w:val="19"/>
+                <w:szCs w:val="19"/>
+              </w:rPr>
+              <w:t xml:space="preserve"> </w:t>
             </w:r>
             <w:r>
               <w:rPr>
@@ -1499,16 +1536,31 @@
                 <w:sz w:val="19"/>
                 <w:szCs w:val="19"/>
               </w:rPr>
-              <w:t xml:space="preserve"> y publicarla</w:t>
-            </w:r>
-            <w:r>
-              <w:rPr>
-                <w:rFonts w:ascii="Calibri" w:hAnsi="Calibri" w:cs="Calibri"/>
-                <w:color w:val="1F1A1A"/>
-                <w:sz w:val="19"/>
-                <w:szCs w:val="19"/>
-              </w:rPr>
-              <w:t xml:space="preserve"> con Firebase Hosting</w:t>
+              <w:t>ya está lleno</w:t>
+            </w:r>
+            <w:r>
+              <w:rPr>
+                <w:rFonts w:ascii="Calibri" w:hAnsi="Calibri" w:cs="Calibri"/>
+                <w:color w:val="1F1A1A"/>
+                <w:sz w:val="19"/>
+                <w:szCs w:val="19"/>
+              </w:rPr>
+              <w:t xml:space="preserve"> </w:t>
+            </w:r>
+            <w:r>
+              <w:rPr>
+                <w:rFonts w:ascii="Calibri" w:hAnsi="Calibri" w:cs="Calibri"/>
+                <w:color w:val="1F1A1A"/>
+                <w:sz w:val="19"/>
+                <w:szCs w:val="19"/>
+              </w:rPr>
+              <w:t xml:space="preserve">(20 oct, bitácora 20-05); mientras tanto se puede abrir en esta computadora con </w:t>
+            </w:r>
+            <w:r>
+              <w:rPr>
+                <w:rStyle w:val="HTMLCode"/>
+              </w:rPr>
+              <w:t>docs/herramientas/servidor_web.ps1</w:t>
             </w:r>
           </w:p>
         </w:tc>
@@ -1584,7 +1636,7 @@
                 <w:sz w:val="19"/>
                 <w:szCs w:val="19"/>
               </w:rPr>
-              <w:t xml:space="preserve">Sin esto Control Escolar y Enfermería siguen usando la consola. Pasos en </w:t>
+              <w:t xml:space="preserve">Sin publicarla, Control Escolar y Enfermería solo pueden usarla en la computadora donde está el proyecto. Pasos en </w:t>
             </w:r>
             <w:hyperlink r:id="rId5" w:history="1">
               <w:r>
@@ -1637,8 +1689,7 @@
           <w:sz w:val="22"/>
           <w:szCs w:val="22"/>
         </w:rPr>
-        <w:lastRenderedPageBreak/>
-        <w:pict w14:anchorId="77B57FBF">
+        <w:pict w14:anchorId="54E02EF6">
           <v:rect id="_x0000_i1026" style="width:0;height:1.5pt" o:hralign="center" o:hrstd="t" o:hr="t" fillcolor="#a0a0a0" stroked="f"/>
         </w:pict>
       </w:r>
@@ -1836,7 +1887,16 @@
           <w:sz w:val="22"/>
           <w:szCs w:val="22"/>
         </w:rPr>
-        <w:t xml:space="preserve"> (ADR-011, carpeta </w:t>
+        <w:t xml:space="preserve"> </w:t>
+      </w:r>
+      <w:r>
+        <w:rPr>
+          <w:rFonts w:ascii="Calibri" w:eastAsia="Times New Roman" w:hAnsi="Calibri" w:cs="Calibri"/>
+          <w:color w:val="1F1A1A"/>
+          <w:sz w:val="22"/>
+          <w:szCs w:val="22"/>
+        </w:rPr>
+        <w:t xml:space="preserve">(ADR-011, carpeta </w:t>
       </w:r>
       <w:r>
         <w:rPr>
@@ -2001,7 +2061,7 @@
           <w:sz w:val="22"/>
           <w:szCs w:val="22"/>
         </w:rPr>
-        <w:pict w14:anchorId="08F2CA9C">
+        <w:pict w14:anchorId="37767227">
           <v:rect id="_x0000_i1027" style="width:0;height:1.5pt" o:hralign="center" o:hrstd="t" o:hr="t" fillcolor="#a0a0a0" stroked="f"/>
         </w:pict>
       </w:r>
@@ -2580,6 +2640,7 @@
                 <w:sz w:val="19"/>
                 <w:szCs w:val="19"/>
               </w:rPr>
+              <w:lastRenderedPageBreak/>
               <w:t>¿Qué diferencia hay entre reporte y llamada de atención? ¿Los ven el alumno y el padre?</w:t>
             </w:r>
           </w:p>
@@ -2754,7 +2815,6 @@
                 <w:sz w:val="19"/>
                 <w:szCs w:val="19"/>
               </w:rPr>
-              <w:lastRenderedPageBreak/>
               <w:t>¿De qué se le avisa al padre?</w:t>
             </w:r>
           </w:p>
@@ -3909,7 +3969,7 @@
           <w:sz w:val="22"/>
           <w:szCs w:val="22"/>
         </w:rPr>
-        <w:pict w14:anchorId="65537ED6">
+        <w:pict w14:anchorId="56061364">
           <v:rect id="_x0000_i1028" style="width:0;height:1.5pt" o:hralign="center" o:hrstd="t" o:hr="t" fillcolor="#a0a0a0" stroked="f"/>
         </w:pict>
       </w:r>
@@ -5080,7 +5140,7 @@
           <w:sz w:val="22"/>
           <w:szCs w:val="22"/>
         </w:rPr>
-        <w:pict w14:anchorId="4F35D279">
+        <w:pict w14:anchorId="4222B945">
           <v:rect id="_x0000_i1029" style="width:0;height:1.5pt" o:hralign="center" o:hrstd="t" o:hr="t" fillcolor="#a0a0a0" stroked="f"/>
         </w:pict>
       </w:r>
@@ -5899,16 +5959,7 @@
                 <w:sz w:val="19"/>
                 <w:szCs w:val="19"/>
               </w:rPr>
-              <w:t xml:space="preserve"> </w:t>
-            </w:r>
-            <w:r>
-              <w:rPr>
-                <w:rFonts w:ascii="Calibri" w:hAnsi="Calibri" w:cs="Calibri"/>
-                <w:color w:val="1F1A1A"/>
-                <w:sz w:val="19"/>
-                <w:szCs w:val="19"/>
-              </w:rPr>
-              <w:t xml:space="preserve">(estatus amarillos, aviso de contraseña vencida). Todavía no están en </w:t>
+              <w:t xml:space="preserve"> (estatus amarillos, aviso de contraseña vencida). Todavía no están en </w:t>
             </w:r>
             <w:r>
               <w:rPr>
@@ -6096,7 +6147,7 @@
           <w:sz w:val="22"/>
           <w:szCs w:val="22"/>
         </w:rPr>
-        <w:pict w14:anchorId="5ED85A06">
+        <w:pict w14:anchorId="492A7305">
           <v:rect id="_x0000_i1030" style="width:0;height:1.5pt" o:hralign="center" o:hrstd="t" o:hr="t" fillcolor="#a0a0a0" stroked="f"/>
         </w:pict>
       </w:r>
@@ -8457,7 +8508,7 @@
           <w:sz w:val="22"/>
           <w:szCs w:val="22"/>
         </w:rPr>
-        <w:pict w14:anchorId="2D0291DD">
+        <w:pict w14:anchorId="7C8B5051">
           <v:rect id="_x0000_i1031" style="width:0;height:1.5pt" o:hralign="center" o:hrstd="t" o:hr="t" fillcolor="#a0a0a0" stroked="f"/>
         </w:pict>
       </w:r>
@@ -9304,7 +9355,7 @@
           <w:sz w:val="22"/>
           <w:szCs w:val="22"/>
         </w:rPr>
-        <w:pict w14:anchorId="56A2A486">
+        <w:pict w14:anchorId="07953AE6">
           <v:rect id="_x0000_i1032" style="width:0;height:1.5pt" o:hralign="center" o:hrstd="t" o:hr="t" fillcolor="#a0a0a0" stroked="f"/>
         </w:pict>
       </w:r>
@@ -11013,7 +11064,7 @@
           <w:sz w:val="22"/>
           <w:szCs w:val="22"/>
         </w:rPr>
-        <w:pict w14:anchorId="388E8F55">
+        <w:pict w14:anchorId="03014C9F">
           <v:rect id="_x0000_i1033" style="width:0;height:1.5pt" o:hralign="center" o:hrstd="t" o:hr="t" fillcolor="#a0a0a0" stroked="f"/>
         </w:pict>
       </w:r>
@@ -11563,7 +11614,7 @@
           <w:sz w:val="22"/>
           <w:szCs w:val="22"/>
         </w:rPr>
-        <w:pict w14:anchorId="501D83DF">
+        <w:pict w14:anchorId="63E512AD">
           <v:rect id="_x0000_i1034" style="width:0;height:1.5pt" o:hralign="center" o:hrstd="t" o:hr="t" fillcolor="#a0a0a0" stroked="f"/>
         </w:pict>
       </w:r>
@@ -12736,7 +12787,7 @@
           <w:sz w:val="22"/>
           <w:szCs w:val="22"/>
         </w:rPr>
-        <w:pict w14:anchorId="1758F39B">
+        <w:pict w14:anchorId="660A696A">
           <v:rect id="_x0000_i1035" style="width:0;height:1.5pt" o:hralign="center" o:hrstd="t" o:hr="t" fillcolor="#a0a0a0" stroked="f"/>
         </w:pict>
       </w:r>
@@ -12893,7 +12944,7 @@
           <w:sz w:val="22"/>
           <w:szCs w:val="22"/>
         </w:rPr>
-        <w:pict w14:anchorId="4A8642DF">
+        <w:pict w14:anchorId="387AEDF0">
           <v:rect id="_x0000_i1036" style="width:0;height:1.5pt" o:hralign="center" o:hrstd="t" o:hr="t" fillcolor="#a0a0a0" stroked="f"/>
         </w:pict>
       </w:r>
@@ -12915,7 +12966,7 @@
     <w:p>
       <w:pPr>
         <w:shd w:val="clear" w:color="auto" w:fill="F7F5F4"/>
-        <w:divId w:val="200365991"/>
+        <w:divId w:val="489519631"/>
         <w:rPr>
           <w:rFonts w:ascii="Calibri" w:eastAsia="Times New Roman" w:hAnsi="Calibri" w:cs="Calibri"/>
           <w:color w:val="1F1A1A"/>
@@ -14637,13 +14688,13 @@
 <file path=word/numbering.xml><?xml version="1.0" encoding="utf-8"?>
 <w:numbering xmlns:wpc="http://schemas.microsoft.com/office/word/2010/wordprocessingCanvas" xmlns:cx="http://schemas.microsoft.com/office/drawing/2014/chartex" xmlns:cx1="http://schemas.microsoft.com/office/drawing/2015/9/8/chartex" xmlns:cx2="http://schemas.microsoft.com/office/drawing/2015/10/21/chartex" xmlns:cx3="http://schemas.microsoft.com/office/drawing/2016/5/9/chartex" xmlns:cx4="http://schemas.microsoft.com/office/drawing/2016/5/10/chartex" xmlns:cx5="http://schemas.microsoft.com/office/drawing/2016/5/11/chartex" xmlns:cx6="http://schemas.microsoft.com/office/drawing/2016/5/12/chartex" xmlns:cx7="http://schemas.microsoft.com/office/drawing/2016/5/13/chartex" xmlns:cx8="http://schemas.microsoft.com/office/drawing/2016/5/14/chartex" xmlns:mc="http://schemas.openxmlformats.org/markup-compatibility/2006" xmlns:aink="http://schemas.microsoft.com/office/drawing/2016/ink" xmlns:am3d="http://schemas.microsoft.com/office/drawing/2017/model3d" xmlns:o="urn:schemas-microsoft-com:office:office" xmlns:oel="http://schemas.microsoft.com/office/2019/extlst" xmlns:r="http://schemas.openxmlformats.org/officeDocument/2006/relationships" xmlns:m="http://schemas.openxmlformats.org/officeDocument/2006/math" xmlns:v="urn:schemas-microsoft-com:vml" xmlns:wp14="http://schemas.microsoft.com/office/word/2010/wordprocessingDrawing" xmlns:wp="http://schemas.openxmlformats.org/drawingml/2006/wordprocessingDrawing" xmlns:w10="urn:schemas-microsoft-com:office:word" xmlns:w="http://schemas.openxmlformats.org/wordprocessingml/2006/main" xmlns:w14="http://schemas.microsoft.com/office/word/2010/wordml" xmlns:w15="http://schemas.microsoft.com/office/word/2012/wordml" xmlns:w16cex="http://schemas.microsoft.com/office/word/2018/wordml/cex" xmlns:w16cid="http://schemas.microsoft.com/office/word/2016/wordml/cid" xmlns:w16="http://schemas.microsoft.com/office/word/2018/wordml" xmlns:w16du="http://schemas.microsoft.com/office/word/2023/wordml/word16du" xmlns:w16sdtdh="http://schemas.microsoft.com/office/word/2020/wordml/sdtdatahash" xmlns:w16sdtfl="http://schemas.microsoft.com/office/word/2024/wordml/sdtformatlock" xmlns:w16se="http://schemas.microsoft.com/office/word/2015/wordml/symex" xmlns:wpg="http://schemas.microsoft.com/office/word/2010/wordprocessingGroup" xmlns:wpi="http://schemas.microsoft.com/office/word/2010/wordprocessingInk" xmlns:wne="http://schemas.microsoft.com/office/word/2006/wordml" xmlns:wps="http://schemas.microsoft.com/office/word/2010/wordprocessingShape" mc:Ignorable="w14 w15 w16se w16cid w16 w16cex w16sdtdh w16sdtfl w16du wp14">
   <w:abstractNum w:abstractNumId="0" w15:restartNumberingAfterBreak="0">
-    <w:nsid w:val="0BF56FC0"/>
+    <w:nsid w:val="1326399C"/>
     <w:multiLevelType w:val="multilevel"/>
-    <w:tmpl w:val="AB8210B2"/>
+    <w:tmpl w:val="E4CCEC08"/>
     <w:lvl w:ilvl="0">
       <w:start w:val="1"/>
-      <w:numFmt w:val="decimal"/>
-      <w:lvlText w:val="%1."/>
+      <w:numFmt w:val="bullet"/>
+      <w:lvlText w:val=""/>
       <w:lvlJc w:val="left"/>
       <w:pPr>
         <w:tabs>
@@ -14651,11 +14702,15 @@
         </w:tabs>
         <w:ind w:left="720" w:hanging="360"/>
       </w:pPr>
+      <w:rPr>
+        <w:rFonts w:ascii="Symbol" w:hAnsi="Symbol" w:hint="default"/>
+        <w:sz w:val="20"/>
+      </w:rPr>
     </w:lvl>
     <w:lvl w:ilvl="1" w:tentative="1">
       <w:start w:val="1"/>
-      <w:numFmt w:val="decimal"/>
-      <w:lvlText w:val="%2."/>
+      <w:numFmt w:val="bullet"/>
+      <w:lvlText w:val="o"/>
       <w:lvlJc w:val="left"/>
       <w:pPr>
         <w:tabs>
@@ -14663,11 +14718,15 @@
         </w:tabs>
         <w:ind w:left="1440" w:hanging="360"/>
       </w:pPr>
+      <w:rPr>
+        <w:rFonts w:ascii="Courier New" w:hAnsi="Courier New" w:hint="default"/>
+        <w:sz w:val="20"/>
+      </w:rPr>
     </w:lvl>
     <w:lvl w:ilvl="2" w:tentative="1">
       <w:start w:val="1"/>
-      <w:numFmt w:val="decimal"/>
-      <w:lvlText w:val="%3."/>
+      <w:numFmt w:val="bullet"/>
+      <w:lvlText w:val=""/>
       <w:lvlJc w:val="left"/>
       <w:pPr>
         <w:tabs>
@@ -14675,11 +14734,15 @@
         </w:tabs>
         <w:ind w:left="2160" w:hanging="360"/>
       </w:pPr>
+      <w:rPr>
+        <w:rFonts w:ascii="Wingdings" w:hAnsi="Wingdings" w:hint="default"/>
+        <w:sz w:val="20"/>
+      </w:rPr>
     </w:lvl>
     <w:lvl w:ilvl="3" w:tentative="1">
       <w:start w:val="1"/>
-      <w:numFmt w:val="decimal"/>
-      <w:lvlText w:val="%4."/>
+      <w:numFmt w:val="bullet"/>
+      <w:lvlText w:val=""/>
       <w:lvlJc w:val="left"/>
       <w:pPr>
         <w:tabs>
@@ -14687,11 +14750,15 @@
         </w:tabs>
         <w:ind w:left="2880" w:hanging="360"/>
       </w:pPr>
+      <w:rPr>
+        <w:rFonts w:ascii="Wingdings" w:hAnsi="Wingdings" w:hint="default"/>
+        <w:sz w:val="20"/>
+      </w:rPr>
     </w:lvl>
     <w:lvl w:ilvl="4" w:tentative="1">
       <w:start w:val="1"/>
-      <w:numFmt w:val="decimal"/>
-      <w:lvlText w:val="%5."/>
+      <w:numFmt w:val="bullet"/>
+      <w:lvlText w:val=""/>
       <w:lvlJc w:val="left"/>
       <w:pPr>
         <w:tabs>
@@ -14699,11 +14766,15 @@
         </w:tabs>
         <w:ind w:left="3600" w:hanging="360"/>
       </w:pPr>
+      <w:rPr>
+        <w:rFonts w:ascii="Wingdings" w:hAnsi="Wingdings" w:hint="default"/>
+        <w:sz w:val="20"/>
+      </w:rPr>
     </w:lvl>
     <w:lvl w:ilvl="5" w:tentative="1">
       <w:start w:val="1"/>
-      <w:numFmt w:val="decimal"/>
-      <w:lvlText w:val="%6."/>
+      <w:numFmt w:val="bullet"/>
+      <w:lvlText w:val=""/>
       <w:lvlJc w:val="left"/>
       <w:pPr>
         <w:tabs>
@@ -14711,11 +14782,15 @@
         </w:tabs>
         <w:ind w:left="4320" w:hanging="360"/>
       </w:pPr>
+      <w:rPr>
+        <w:rFonts w:ascii="Wingdings" w:hAnsi="Wingdings" w:hint="default"/>
+        <w:sz w:val="20"/>
+      </w:rPr>
     </w:lvl>
     <w:lvl w:ilvl="6" w:tentative="1">
       <w:start w:val="1"/>
-      <w:numFmt w:val="decimal"/>
-      <w:lvlText w:val="%7."/>
+      <w:numFmt w:val="bullet"/>
+      <w:lvlText w:val=""/>
       <w:lvlJc w:val="left"/>
       <w:pPr>
         <w:tabs>
@@ -14723,11 +14798,15 @@
         </w:tabs>
         <w:ind w:left="5040" w:hanging="360"/>
       </w:pPr>
+      <w:rPr>
+        <w:rFonts w:ascii="Wingdings" w:hAnsi="Wingdings" w:hint="default"/>
+        <w:sz w:val="20"/>
+      </w:rPr>
     </w:lvl>
     <w:lvl w:ilvl="7" w:tentative="1">
       <w:start w:val="1"/>
-      <w:numFmt w:val="decimal"/>
-      <w:lvlText w:val="%8."/>
+      <w:numFmt w:val="bullet"/>
+      <w:lvlText w:val=""/>
       <w:lvlJc w:val="left"/>
       <w:pPr>
         <w:tabs>
@@ -14735,11 +14814,15 @@
         </w:tabs>
         <w:ind w:left="5760" w:hanging="360"/>
       </w:pPr>
+      <w:rPr>
+        <w:rFonts w:ascii="Wingdings" w:hAnsi="Wingdings" w:hint="default"/>
+        <w:sz w:val="20"/>
+      </w:rPr>
     </w:lvl>
     <w:lvl w:ilvl="8" w:tentative="1">
       <w:start w:val="1"/>
-      <w:numFmt w:val="decimal"/>
-      <w:lvlText w:val="%9."/>
+      <w:numFmt w:val="bullet"/>
+      <w:lvlText w:val=""/>
       <w:lvlJc w:val="left"/>
       <w:pPr>
         <w:tabs>
@@ -14747,12 +14830,16 @@
         </w:tabs>
         <w:ind w:left="6480" w:hanging="360"/>
       </w:pPr>
+      <w:rPr>
+        <w:rFonts w:ascii="Wingdings" w:hAnsi="Wingdings" w:hint="default"/>
+        <w:sz w:val="20"/>
+      </w:rPr>
     </w:lvl>
   </w:abstractNum>
   <w:abstractNum w:abstractNumId="1" w15:restartNumberingAfterBreak="0">
-    <w:nsid w:val="2EAA5F2F"/>
+    <w:nsid w:val="3711449B"/>
     <w:multiLevelType w:val="multilevel"/>
-    <w:tmpl w:val="CA804296"/>
+    <w:tmpl w:val="57EC8A9A"/>
     <w:lvl w:ilvl="0">
       <w:start w:val="1"/>
       <w:numFmt w:val="bullet"/>
@@ -14899,13 +14986,13 @@
     </w:lvl>
   </w:abstractNum>
   <w:abstractNum w:abstractNumId="2" w15:restartNumberingAfterBreak="0">
-    <w:nsid w:val="7FB94237"/>
+    <w:nsid w:val="79644034"/>
     <w:multiLevelType w:val="multilevel"/>
-    <w:tmpl w:val="E99CCA0C"/>
+    <w:tmpl w:val="7A9A0808"/>
     <w:lvl w:ilvl="0">
       <w:start w:val="1"/>
-      <w:numFmt w:val="bullet"/>
-      <w:lvlText w:val=""/>
+      <w:numFmt w:val="decimal"/>
+      <w:lvlText w:val="%1."/>
       <w:lvlJc w:val="left"/>
       <w:pPr>
         <w:tabs>
@@ -14913,15 +15000,11 @@
         </w:tabs>
         <w:ind w:left="720" w:hanging="360"/>
       </w:pPr>
-      <w:rPr>
-        <w:rFonts w:ascii="Symbol" w:hAnsi="Symbol" w:hint="default"/>
-        <w:sz w:val="20"/>
-      </w:rPr>
     </w:lvl>
     <w:lvl w:ilvl="1" w:tentative="1">
       <w:start w:val="1"/>
-      <w:numFmt w:val="bullet"/>
-      <w:lvlText w:val="o"/>
+      <w:numFmt w:val="decimal"/>
+      <w:lvlText w:val="%2."/>
       <w:lvlJc w:val="left"/>
       <w:pPr>
         <w:tabs>
@@ -14929,15 +15012,11 @@
         </w:tabs>
         <w:ind w:left="1440" w:hanging="360"/>
       </w:pPr>
-      <w:rPr>
-        <w:rFonts w:ascii="Courier New" w:hAnsi="Courier New" w:hint="default"/>
-        <w:sz w:val="20"/>
-      </w:rPr>
     </w:lvl>
     <w:lvl w:ilvl="2" w:tentative="1">
       <w:start w:val="1"/>
-      <w:numFmt w:val="bullet"/>
-      <w:lvlText w:val=""/>
+      <w:numFmt w:val="decimal"/>
+      <w:lvlText w:val="%3."/>
       <w:lvlJc w:val="left"/>
       <w:pPr>
         <w:tabs>
@@ -14945,15 +15024,11 @@
         </w:tabs>
         <w:ind w:left="2160" w:hanging="360"/>
       </w:pPr>
-      <w:rPr>
-        <w:rFonts w:ascii="Wingdings" w:hAnsi="Wingdings" w:hint="default"/>
-        <w:sz w:val="20"/>
-      </w:rPr>
     </w:lvl>
     <w:lvl w:ilvl="3" w:tentative="1">
       <w:start w:val="1"/>
-      <w:numFmt w:val="bullet"/>
-      <w:lvlText w:val=""/>
+      <w:numFmt w:val="decimal"/>
+      <w:lvlText w:val="%4."/>
       <w:lvlJc w:val="left"/>
       <w:pPr>
         <w:tabs>
@@ -14961,15 +15036,11 @@
         </w:tabs>
         <w:ind w:left="2880" w:hanging="360"/>
       </w:pPr>
-      <w:rPr>
-        <w:rFonts w:ascii="Wingdings" w:hAnsi="Wingdings" w:hint="default"/>
-        <w:sz w:val="20"/>
-      </w:rPr>
     </w:lvl>
     <w:lvl w:ilvl="4" w:tentative="1">
       <w:start w:val="1"/>
-      <w:numFmt w:val="bullet"/>
-      <w:lvlText w:val=""/>
+      <w:numFmt w:val="decimal"/>
+      <w:lvlText w:val="%5."/>
       <w:lvlJc w:val="left"/>
       <w:pPr>
         <w:tabs>
@@ -14977,15 +15048,11 @@
         </w:tabs>
         <w:ind w:left="3600" w:hanging="360"/>
       </w:pPr>
-      <w:rPr>
-        <w:rFonts w:ascii="Wingdings" w:hAnsi="Wingdings" w:hint="default"/>
-        <w:sz w:val="20"/>
-      </w:rPr>
     </w:lvl>
     <w:lvl w:ilvl="5" w:tentative="1">
       <w:start w:val="1"/>
-      <w:numFmt w:val="bullet"/>
-      <w:lvlText w:val=""/>
+      <w:numFmt w:val="decimal"/>
+      <w:lvlText w:val="%6."/>
       <w:lvlJc w:val="left"/>
       <w:pPr>
         <w:tabs>
@@ -14993,15 +15060,11 @@
         </w:tabs>
         <w:ind w:left="4320" w:hanging="360"/>
       </w:pPr>
-      <w:rPr>
-        <w:rFonts w:ascii="Wingdings" w:hAnsi="Wingdings" w:hint="default"/>
-        <w:sz w:val="20"/>
-      </w:rPr>
     </w:lvl>
     <w:lvl w:ilvl="6" w:tentative="1">
       <w:start w:val="1"/>
-      <w:numFmt w:val="bullet"/>
-      <w:lvlText w:val=""/>
+      <w:numFmt w:val="decimal"/>
+      <w:lvlText w:val="%7."/>
       <w:lvlJc w:val="left"/>
       <w:pPr>
         <w:tabs>
@@ -15009,15 +15072,11 @@
         </w:tabs>
         <w:ind w:left="5040" w:hanging="360"/>
       </w:pPr>
-      <w:rPr>
-        <w:rFonts w:ascii="Wingdings" w:hAnsi="Wingdings" w:hint="default"/>
-        <w:sz w:val="20"/>
-      </w:rPr>
     </w:lvl>
     <w:lvl w:ilvl="7" w:tentative="1">
       <w:start w:val="1"/>
-      <w:numFmt w:val="bullet"/>
-      <w:lvlText w:val=""/>
+      <w:numFmt w:val="decimal"/>
+      <w:lvlText w:val="%8."/>
       <w:lvlJc w:val="left"/>
       <w:pPr>
         <w:tabs>
@@ -15025,15 +15084,11 @@
         </w:tabs>
         <w:ind w:left="5760" w:hanging="360"/>
       </w:pPr>
-      <w:rPr>
-        <w:rFonts w:ascii="Wingdings" w:hAnsi="Wingdings" w:hint="default"/>
-        <w:sz w:val="20"/>
-      </w:rPr>
     </w:lvl>
     <w:lvl w:ilvl="8" w:tentative="1">
       <w:start w:val="1"/>
-      <w:numFmt w:val="bullet"/>
-      <w:lvlText w:val=""/>
+      <w:numFmt w:val="decimal"/>
+      <w:lvlText w:val="%9."/>
       <w:lvlJc w:val="left"/>
       <w:pPr>
         <w:tabs>
@@ -15041,19 +15096,15 @@
         </w:tabs>
         <w:ind w:left="6480" w:hanging="360"/>
       </w:pPr>
-      <w:rPr>
-        <w:rFonts w:ascii="Wingdings" w:hAnsi="Wingdings" w:hint="default"/>
-        <w:sz w:val="20"/>
-      </w:rPr>
     </w:lvl>
   </w:abstractNum>
-  <w:num w:numId="1" w16cid:durableId="1530026463">
+  <w:num w:numId="1" w16cid:durableId="1091269168">
+    <w:abstractNumId w:val="0"/>
+  </w:num>
+  <w:num w:numId="2" w16cid:durableId="828669074">
     <w:abstractNumId w:val="2"/>
   </w:num>
-  <w:num w:numId="2" w16cid:durableId="1862430984">
-    <w:abstractNumId w:val="0"/>
-  </w:num>
-  <w:num w:numId="3" w16cid:durableId="1706951059">
+  <w:num w:numId="3" w16cid:durableId="1827890880">
     <w:abstractNumId w:val="1"/>
   </w:num>
 </w:numbering>

</xml_diff>